<commit_message>
feat: audit all requirements and add report code excerpts
</commit_message>
<xml_diff>
--- a/docs/B24DCCC047_PhamHaiDang_BaoCao.docx
+++ b/docs/B24DCCC047_PhamHaiDang_BaoCao.docx
@@ -595,6 +595,237 @@
         <w:pStyle w:val="Heading1"/>
       </w:pPr>
       <w:r>
+        <w:t>Mã tiêu biểu của màn hình đăng nhập</w:t>
+      </w:r>
+    </w:p>
+    <w:p>
+      <w:pPr>
+        <w:spacing w:before="120"/>
+      </w:pPr>
+      <w:r>
+        <w:t>Các trích đoạn sau được lấy trực tiếp từ mã nguồn. Tài khoản nằm trong LoginActivity; login() đọc hai trường nhập và quyết định hiển thị lỗi hay chuyển Activity.</w:t>
+      </w:r>
+    </w:p>
+    <w:p>
+      <w:pPr>
+        <w:pStyle w:val="Heading2"/>
+      </w:pPr>
+      <w:r>
+        <w:t>Tài khoản cố định</w:t>
+      </w:r>
+    </w:p>
+    <w:p>
+      <w:pPr>
+        <w:pStyle w:val="Caption"/>
+        <w:spacing w:after="100"/>
+      </w:pPr>
+      <w:r>
+        <w:t>LoginActivity.java - dòng 12 đến 13</w:t>
+      </w:r>
+    </w:p>
+    <w:p>
+      <w:pPr>
+        <w:keepNext/>
+        <w:spacing w:after="0" w:before="0" w:line="252" w:lineRule="auto"/>
+        <w:ind w:left="144"/>
+      </w:pPr>
+      <w:r>
+        <w:rPr>
+          <w:rFonts w:ascii="DejaVu Sans Mono" w:hAnsi="DejaVu Sans Mono"/>
+          <w:sz w:val="18"/>
+        </w:rPr>
+        <w:t>private static final String USERNAME = "admin";</w:t>
+      </w:r>
+    </w:p>
+    <w:p>
+      <w:pPr>
+        <w:keepNext w:val="0"/>
+        <w:spacing w:after="0" w:before="0" w:line="252" w:lineRule="auto"/>
+        <w:ind w:left="144"/>
+      </w:pPr>
+      <w:r>
+        <w:rPr>
+          <w:rFonts w:ascii="DejaVu Sans Mono" w:hAnsi="DejaVu Sans Mono"/>
+          <w:sz w:val="18"/>
+        </w:rPr>
+        <w:t>private static final String PASSWORD = "123456";</w:t>
+      </w:r>
+    </w:p>
+    <w:p>
+      <w:pPr>
+        <w:pStyle w:val="Heading2"/>
+      </w:pPr>
+      <w:r>
+        <w:t>Kiểm tra dữ liệu và chuyển màn hình</w:t>
+      </w:r>
+    </w:p>
+    <w:p>
+      <w:pPr>
+        <w:pStyle w:val="Caption"/>
+        <w:spacing w:after="100"/>
+      </w:pPr>
+      <w:r>
+        <w:t>LoginActivity.java - dòng 29 đến 38</w:t>
+      </w:r>
+    </w:p>
+    <w:p>
+      <w:pPr>
+        <w:keepNext/>
+        <w:spacing w:after="0" w:before="0" w:line="252" w:lineRule="auto"/>
+        <w:ind w:left="144"/>
+      </w:pPr>
+      <w:r>
+        <w:rPr>
+          <w:rFonts w:ascii="DejaVu Sans Mono" w:hAnsi="DejaVu Sans Mono"/>
+          <w:sz w:val="18"/>
+        </w:rPr>
+        <w:t>if (name.isEmpty() || pass.isEmpty()) {</w:t>
+      </w:r>
+    </w:p>
+    <w:p>
+      <w:pPr>
+        <w:keepNext/>
+        <w:spacing w:after="0" w:before="0" w:line="252" w:lineRule="auto"/>
+        <w:ind w:left="144"/>
+      </w:pPr>
+      <w:r>
+        <w:rPr>
+          <w:rFonts w:ascii="DejaVu Sans Mono" w:hAnsi="DejaVu Sans Mono"/>
+          <w:sz w:val="18"/>
+        </w:rPr>
+        <w:t xml:space="preserve">    error.setText(R.string.login_empty);</w:t>
+      </w:r>
+    </w:p>
+    <w:p>
+      <w:pPr>
+        <w:keepNext/>
+        <w:spacing w:after="0" w:before="0" w:line="252" w:lineRule="auto"/>
+        <w:ind w:left="144"/>
+      </w:pPr>
+      <w:r>
+        <w:rPr>
+          <w:rFonts w:ascii="DejaVu Sans Mono" w:hAnsi="DejaVu Sans Mono"/>
+          <w:sz w:val="18"/>
+        </w:rPr>
+        <w:t xml:space="preserve">    error.setVisibility(View.VISIBLE);</w:t>
+      </w:r>
+    </w:p>
+    <w:p>
+      <w:pPr>
+        <w:keepNext/>
+        <w:spacing w:after="0" w:before="0" w:line="252" w:lineRule="auto"/>
+        <w:ind w:left="144"/>
+      </w:pPr>
+      <w:r>
+        <w:rPr>
+          <w:rFonts w:ascii="DejaVu Sans Mono" w:hAnsi="DejaVu Sans Mono"/>
+          <w:sz w:val="18"/>
+        </w:rPr>
+        <w:t>} else if (!USERNAME.equals(name) || !PASSWORD.equals(pass)) {</w:t>
+      </w:r>
+    </w:p>
+    <w:p>
+      <w:pPr>
+        <w:keepNext/>
+        <w:spacing w:after="0" w:before="0" w:line="252" w:lineRule="auto"/>
+        <w:ind w:left="144"/>
+      </w:pPr>
+      <w:r>
+        <w:rPr>
+          <w:rFonts w:ascii="DejaVu Sans Mono" w:hAnsi="DejaVu Sans Mono"/>
+          <w:sz w:val="18"/>
+        </w:rPr>
+        <w:t xml:space="preserve">    error.setText(R.string.login_wrong);</w:t>
+      </w:r>
+    </w:p>
+    <w:p>
+      <w:pPr>
+        <w:keepNext/>
+        <w:spacing w:after="0" w:before="0" w:line="252" w:lineRule="auto"/>
+        <w:ind w:left="144"/>
+      </w:pPr>
+      <w:r>
+        <w:rPr>
+          <w:rFonts w:ascii="DejaVu Sans Mono" w:hAnsi="DejaVu Sans Mono"/>
+          <w:sz w:val="18"/>
+        </w:rPr>
+        <w:t xml:space="preserve">    error.setVisibility(View.VISIBLE);</w:t>
+      </w:r>
+    </w:p>
+    <w:p>
+      <w:pPr>
+        <w:keepNext/>
+        <w:spacing w:after="0" w:before="0" w:line="252" w:lineRule="auto"/>
+        <w:ind w:left="144"/>
+      </w:pPr>
+      <w:r>
+        <w:rPr>
+          <w:rFonts w:ascii="DejaVu Sans Mono" w:hAnsi="DejaVu Sans Mono"/>
+          <w:sz w:val="18"/>
+        </w:rPr>
+        <w:t>} else {</w:t>
+      </w:r>
+    </w:p>
+    <w:p>
+      <w:pPr>
+        <w:keepNext/>
+        <w:spacing w:after="0" w:before="0" w:line="252" w:lineRule="auto"/>
+        <w:ind w:left="144"/>
+      </w:pPr>
+      <w:r>
+        <w:rPr>
+          <w:rFonts w:ascii="DejaVu Sans Mono" w:hAnsi="DejaVu Sans Mono"/>
+          <w:sz w:val="18"/>
+        </w:rPr>
+        <w:t xml:space="preserve">    startActivity(new Intent(this, MainActivity.class));</w:t>
+      </w:r>
+    </w:p>
+    <w:p>
+      <w:pPr>
+        <w:keepNext/>
+        <w:spacing w:after="0" w:before="0" w:line="252" w:lineRule="auto"/>
+        <w:ind w:left="144"/>
+      </w:pPr>
+      <w:r>
+        <w:rPr>
+          <w:rFonts w:ascii="DejaVu Sans Mono" w:hAnsi="DejaVu Sans Mono"/>
+          <w:sz w:val="18"/>
+        </w:rPr>
+        <w:t xml:space="preserve">    finish();</w:t>
+      </w:r>
+    </w:p>
+    <w:p>
+      <w:pPr>
+        <w:keepNext w:val="0"/>
+        <w:spacing w:after="0" w:before="0" w:line="252" w:lineRule="auto"/>
+        <w:ind w:left="144"/>
+      </w:pPr>
+      <w:r>
+        <w:rPr>
+          <w:rFonts w:ascii="DejaVu Sans Mono" w:hAnsi="DejaVu Sans Mono"/>
+          <w:sz w:val="18"/>
+        </w:rPr>
+        <w:t>}</w:t>
+      </w:r>
+    </w:p>
+    <w:p>
+      <w:pPr>
+        <w:spacing w:before="120"/>
+      </w:pPr>
+      <w:r>
+        <w:t>Nhánh đầu chặn thiếu thông tin; nhánh tiếp theo dùng đúng thông báo lỗi quy định. Chỉ nhánh else mở MainActivity và finish() màn hình đăng nhập. TextView báo lỗi ban đầu được đặt visibility="gone" trong XML.</w:t>
+      </w:r>
+    </w:p>
+    <w:p>
+      <w:r>
+        <w:br w:type="page"/>
+      </w:r>
+    </w:p>
+    <w:p>
+      <w:pPr>
+        <w:pStyle w:val="Heading1"/>
+      </w:pPr>
+      <w:r>
         <w:t>4 Danh sách liên hệ MainActivity</w:t>
       </w:r>
     </w:p>
@@ -710,6 +941,372 @@
         <w:pStyle w:val="Heading1"/>
       </w:pPr>
       <w:r>
+        <w:t>Mã tiêu biểu của danh sách liên hệ</w:t>
+      </w:r>
+    </w:p>
+    <w:p>
+      <w:pPr>
+        <w:pStyle w:val="Heading2"/>
+      </w:pPr>
+      <w:r>
+        <w:t>Intent mở chi tiết và thêm liên hệ</w:t>
+      </w:r>
+    </w:p>
+    <w:p>
+      <w:pPr>
+        <w:pStyle w:val="Caption"/>
+        <w:spacing w:after="100"/>
+      </w:pPr>
+      <w:r>
+        <w:t>MainActivity.java - dòng 17 đến 23</w:t>
+      </w:r>
+    </w:p>
+    <w:p>
+      <w:pPr>
+        <w:keepNext/>
+        <w:spacing w:after="0" w:before="0" w:line="252" w:lineRule="auto"/>
+        <w:ind w:left="144"/>
+      </w:pPr>
+      <w:r>
+        <w:rPr>
+          <w:rFonts w:ascii="DejaVu Sans Mono" w:hAnsi="DejaVu Sans Mono"/>
+          <w:sz w:val="18"/>
+        </w:rPr>
+        <w:t>list.setOnItemClickListener((parent, view, position, id) -&gt; {</w:t>
+      </w:r>
+    </w:p>
+    <w:p>
+      <w:pPr>
+        <w:keepNext/>
+        <w:spacing w:after="0" w:before="0" w:line="252" w:lineRule="auto"/>
+        <w:ind w:left="144"/>
+      </w:pPr>
+      <w:r>
+        <w:rPr>
+          <w:rFonts w:ascii="DejaVu Sans Mono" w:hAnsi="DejaVu Sans Mono"/>
+          <w:sz w:val="18"/>
+        </w:rPr>
+        <w:t xml:space="preserve">    Intent intent = new Intent(this, ContactDetailActivity.class);</w:t>
+      </w:r>
+    </w:p>
+    <w:p>
+      <w:pPr>
+        <w:keepNext/>
+        <w:spacing w:after="0" w:before="0" w:line="252" w:lineRule="auto"/>
+        <w:ind w:left="144"/>
+      </w:pPr>
+      <w:r>
+        <w:rPr>
+          <w:rFonts w:ascii="DejaVu Sans Mono" w:hAnsi="DejaVu Sans Mono"/>
+          <w:sz w:val="18"/>
+        </w:rPr>
+        <w:t xml:space="preserve">    intent.putExtra(ContactDetailActivity.EXTRA_CONTACT, adapter.getItem(position));</w:t>
+      </w:r>
+    </w:p>
+    <w:p>
+      <w:pPr>
+        <w:keepNext/>
+        <w:spacing w:after="0" w:before="0" w:line="252" w:lineRule="auto"/>
+        <w:ind w:left="144"/>
+      </w:pPr>
+      <w:r>
+        <w:rPr>
+          <w:rFonts w:ascii="DejaVu Sans Mono" w:hAnsi="DejaVu Sans Mono"/>
+          <w:sz w:val="18"/>
+        </w:rPr>
+        <w:t xml:space="preserve">    startActivity(intent);</w:t>
+      </w:r>
+    </w:p>
+    <w:p>
+      <w:pPr>
+        <w:keepNext/>
+        <w:spacing w:after="0" w:before="0" w:line="252" w:lineRule="auto"/>
+        <w:ind w:left="144"/>
+      </w:pPr>
+      <w:r>
+        <w:rPr>
+          <w:rFonts w:ascii="DejaVu Sans Mono" w:hAnsi="DejaVu Sans Mono"/>
+          <w:sz w:val="18"/>
+        </w:rPr>
+        <w:t>});</w:t>
+      </w:r>
+    </w:p>
+    <w:p>
+      <w:pPr>
+        <w:keepNext/>
+        <w:spacing w:after="0" w:before="0" w:line="252" w:lineRule="auto"/>
+        <w:ind w:left="144"/>
+      </w:pPr>
+      <w:r>
+        <w:rPr>
+          <w:rFonts w:ascii="DejaVu Sans Mono" w:hAnsi="DejaVu Sans Mono"/>
+          <w:sz w:val="18"/>
+        </w:rPr>
+        <w:t>findViewById(R.id.addContactButton).setOnClickListener(view -&gt;</w:t>
+      </w:r>
+    </w:p>
+    <w:p>
+      <w:pPr>
+        <w:keepNext w:val="0"/>
+        <w:spacing w:after="0" w:before="0" w:line="252" w:lineRule="auto"/>
+        <w:ind w:left="144"/>
+      </w:pPr>
+      <w:r>
+        <w:rPr>
+          <w:rFonts w:ascii="DejaVu Sans Mono" w:hAnsi="DejaVu Sans Mono"/>
+          <w:sz w:val="18"/>
+        </w:rPr>
+        <w:t xml:space="preserve">        startActivity(new Intent(this, AddContactActivity.class)));</w:t>
+      </w:r>
+    </w:p>
+    <w:p>
+      <w:pPr>
+        <w:pStyle w:val="Heading2"/>
+      </w:pPr>
+      <w:r>
+        <w:t>Nạp lại dữ liệu và thống kê khi quay lại</w:t>
+      </w:r>
+    </w:p>
+    <w:p>
+      <w:pPr>
+        <w:pStyle w:val="Caption"/>
+        <w:spacing w:after="100"/>
+      </w:pPr>
+      <w:r>
+        <w:t>MainActivity.java - dòng 25 đến 31</w:t>
+      </w:r>
+    </w:p>
+    <w:p>
+      <w:pPr>
+        <w:keepNext/>
+        <w:spacing w:after="0" w:before="0" w:line="252" w:lineRule="auto"/>
+        <w:ind w:left="144"/>
+      </w:pPr>
+      <w:r>
+        <w:rPr>
+          <w:rFonts w:ascii="DejaVu Sans Mono" w:hAnsi="DejaVu Sans Mono"/>
+          <w:sz w:val="18"/>
+        </w:rPr>
+        <w:t>@Override protected void onResume() {</w:t>
+      </w:r>
+    </w:p>
+    <w:p>
+      <w:pPr>
+        <w:keepNext/>
+        <w:spacing w:after="0" w:before="0" w:line="252" w:lineRule="auto"/>
+        <w:ind w:left="144"/>
+      </w:pPr>
+      <w:r>
+        <w:rPr>
+          <w:rFonts w:ascii="DejaVu Sans Mono" w:hAnsi="DejaVu Sans Mono"/>
+          <w:sz w:val="18"/>
+        </w:rPr>
+        <w:t xml:space="preserve">    super.onResume();</w:t>
+      </w:r>
+    </w:p>
+    <w:p>
+      <w:pPr>
+        <w:keepNext/>
+        <w:spacing w:after="0" w:before="0" w:line="252" w:lineRule="auto"/>
+        <w:ind w:left="144"/>
+      </w:pPr>
+      <w:r>
+        <w:rPr>
+          <w:rFonts w:ascii="DejaVu Sans Mono" w:hAnsi="DejaVu Sans Mono"/>
+          <w:sz w:val="18"/>
+        </w:rPr>
+        <w:t xml:space="preserve">    ContactRepository repository = ContactRepository.getInstance();</w:t>
+      </w:r>
+    </w:p>
+    <w:p>
+      <w:pPr>
+        <w:keepNext/>
+        <w:spacing w:after="0" w:before="0" w:line="252" w:lineRule="auto"/>
+        <w:ind w:left="144"/>
+      </w:pPr>
+      <w:r>
+        <w:rPr>
+          <w:rFonts w:ascii="DejaVu Sans Mono" w:hAnsi="DejaVu Sans Mono"/>
+          <w:sz w:val="18"/>
+        </w:rPr>
+        <w:t xml:space="preserve">    adapter.submit(repository.getContacts());</w:t>
+      </w:r>
+    </w:p>
+    <w:p>
+      <w:pPr>
+        <w:keepNext/>
+        <w:spacing w:after="0" w:before="0" w:line="252" w:lineRule="auto"/>
+        <w:ind w:left="144"/>
+      </w:pPr>
+      <w:r>
+        <w:rPr>
+          <w:rFonts w:ascii="DejaVu Sans Mono" w:hAnsi="DejaVu Sans Mono"/>
+          <w:sz w:val="18"/>
+        </w:rPr>
+        <w:t xml:space="preserve">    ((TextView) findViewById(R.id.totalCount)).setText(getString(R.string.total_format, adapter.getCount()));</w:t>
+      </w:r>
+    </w:p>
+    <w:p>
+      <w:pPr>
+        <w:keepNext/>
+        <w:spacing w:after="0" w:before="0" w:line="252" w:lineRule="auto"/>
+        <w:ind w:left="144"/>
+      </w:pPr>
+      <w:r>
+        <w:rPr>
+          <w:rFonts w:ascii="DejaVu Sans Mono" w:hAnsi="DejaVu Sans Mono"/>
+          <w:sz w:val="18"/>
+        </w:rPr>
+        <w:t xml:space="preserve">    ((TextView) findViewById(R.id.favoriteCount)).setText(getString(R.string.favorites_format, repository.getFavoriteCount()));</w:t>
+      </w:r>
+    </w:p>
+    <w:p>
+      <w:pPr>
+        <w:keepNext w:val="0"/>
+        <w:spacing w:after="0" w:before="0" w:line="252" w:lineRule="auto"/>
+        <w:ind w:left="144"/>
+      </w:pPr>
+      <w:r>
+        <w:rPr>
+          <w:rFonts w:ascii="DejaVu Sans Mono" w:hAnsi="DejaVu Sans Mono"/>
+          <w:sz w:val="18"/>
+        </w:rPr>
+        <w:t>}</w:t>
+      </w:r>
+    </w:p>
+    <w:p>
+      <w:pPr>
+        <w:pStyle w:val="Heading2"/>
+      </w:pPr>
+      <w:r>
+        <w:t>Hiển thị avatar và dấu sao trong Adapter</w:t>
+      </w:r>
+    </w:p>
+    <w:p>
+      <w:pPr>
+        <w:pStyle w:val="Caption"/>
+        <w:spacing w:after="100"/>
+      </w:pPr>
+      <w:r>
+        <w:t>ContactAdapter.java - dòng 21 đến 27</w:t>
+      </w:r>
+    </w:p>
+    <w:p>
+      <w:pPr>
+        <w:keepNext/>
+        <w:spacing w:after="0" w:before="0" w:line="252" w:lineRule="auto"/>
+        <w:ind w:left="144"/>
+      </w:pPr>
+      <w:r>
+        <w:rPr>
+          <w:rFonts w:ascii="DejaVu Sans Mono" w:hAnsi="DejaVu Sans Mono"/>
+          <w:sz w:val="18"/>
+        </w:rPr>
+        <w:t>Contact contact = getItem(position);</w:t>
+      </w:r>
+    </w:p>
+    <w:p>
+      <w:pPr>
+        <w:keepNext/>
+        <w:spacing w:after="0" w:before="0" w:line="252" w:lineRule="auto"/>
+        <w:ind w:left="144"/>
+      </w:pPr>
+      <w:r>
+        <w:rPr>
+          <w:rFonts w:ascii="DejaVu Sans Mono" w:hAnsi="DejaVu Sans Mono"/>
+          <w:sz w:val="18"/>
+        </w:rPr>
+        <w:t>((TextView) view.findViewById(R.id.avatar)).setText(contact.getInitial());</w:t>
+      </w:r>
+    </w:p>
+    <w:p>
+      <w:pPr>
+        <w:keepNext/>
+        <w:spacing w:after="0" w:before="0" w:line="252" w:lineRule="auto"/>
+        <w:ind w:left="144"/>
+      </w:pPr>
+      <w:r>
+        <w:rPr>
+          <w:rFonts w:ascii="DejaVu Sans Mono" w:hAnsi="DejaVu Sans Mono"/>
+          <w:sz w:val="18"/>
+        </w:rPr>
+        <w:t>((TextView) view.findViewById(R.id.contactName)).setText(contact.getFullName());</w:t>
+      </w:r>
+    </w:p>
+    <w:p>
+      <w:pPr>
+        <w:keepNext/>
+        <w:spacing w:after="0" w:before="0" w:line="252" w:lineRule="auto"/>
+        <w:ind w:left="144"/>
+      </w:pPr>
+      <w:r>
+        <w:rPr>
+          <w:rFonts w:ascii="DejaVu Sans Mono" w:hAnsi="DejaVu Sans Mono"/>
+          <w:sz w:val="18"/>
+        </w:rPr>
+        <w:t>((TextView) view.findViewById(R.id.contactPhone)).setText(contact.getPhone());</w:t>
+      </w:r>
+    </w:p>
+    <w:p>
+      <w:pPr>
+        <w:keepNext/>
+        <w:spacing w:after="0" w:before="0" w:line="252" w:lineRule="auto"/>
+        <w:ind w:left="144"/>
+      </w:pPr>
+      <w:r>
+        <w:rPr>
+          <w:rFonts w:ascii="DejaVu Sans Mono" w:hAnsi="DejaVu Sans Mono"/>
+          <w:sz w:val="18"/>
+        </w:rPr>
+        <w:t>((TextView) view.findViewById(R.id.contactGroup)).setText(contact.getGroup());</w:t>
+      </w:r>
+    </w:p>
+    <w:p>
+      <w:pPr>
+        <w:keepNext/>
+        <w:spacing w:after="0" w:before="0" w:line="252" w:lineRule="auto"/>
+        <w:ind w:left="144"/>
+      </w:pPr>
+      <w:r>
+        <w:rPr>
+          <w:rFonts w:ascii="DejaVu Sans Mono" w:hAnsi="DejaVu Sans Mono"/>
+          <w:sz w:val="18"/>
+        </w:rPr>
+        <w:t>View star = view.findViewById(R.id.favoriteStar);</w:t>
+      </w:r>
+    </w:p>
+    <w:p>
+      <w:pPr>
+        <w:keepNext w:val="0"/>
+        <w:spacing w:after="0" w:before="0" w:line="252" w:lineRule="auto"/>
+        <w:ind w:left="144"/>
+      </w:pPr>
+      <w:r>
+        <w:rPr>
+          <w:rFonts w:ascii="DejaVu Sans Mono" w:hAnsi="DejaVu Sans Mono"/>
+          <w:sz w:val="18"/>
+        </w:rPr>
+        <w:t>star.setVisibility(contact.isFavorite() ? View.VISIBLE : View.GONE);</w:t>
+      </w:r>
+    </w:p>
+    <w:p>
+      <w:pPr>
+        <w:spacing w:before="120"/>
+      </w:pPr>
+      <w:r>
+        <w:t>Contact là Serializable nên putExtra() truyền được đối tượng qua Intent. Danh sách dùng bản sao ArrayList từ repository; dữ liệu gốc được dùng để cập nhật yêu thích. onResume() nạp lại dữ liệu sau thêm, xóa hoặc thay đổi yêu thích.</w:t>
+      </w:r>
+    </w:p>
+    <w:p>
+      <w:r>
+        <w:br w:type="page"/>
+      </w:r>
+    </w:p>
+    <w:p>
+      <w:pPr>
+        <w:pStyle w:val="Heading1"/>
+      </w:pPr>
+      <w:r>
         <w:t>5 Thêm liên hệ AddContactActivity</w:t>
       </w:r>
     </w:p>
@@ -825,6 +1422,344 @@
         <w:pStyle w:val="Heading1"/>
       </w:pPr>
       <w:r>
+        <w:t>Mã tiêu biểu của biểu mẫu thêm liên hệ</w:t>
+      </w:r>
+    </w:p>
+    <w:p>
+      <w:pPr>
+        <w:pStyle w:val="Heading2"/>
+      </w:pPr>
+      <w:r>
+        <w:t>Kiểm tra tên số điện thoại và số trùng</w:t>
+      </w:r>
+    </w:p>
+    <w:p>
+      <w:pPr>
+        <w:pStyle w:val="Caption"/>
+        <w:spacing w:after="100"/>
+      </w:pPr>
+      <w:r>
+        <w:t>AddContactActivity.java - dòng 41 đến 50</w:t>
+      </w:r>
+    </w:p>
+    <w:p>
+      <w:pPr>
+        <w:keepNext/>
+        <w:spacing w:after="0" w:before="0" w:line="252" w:lineRule="auto"/>
+        <w:ind w:left="144"/>
+      </w:pPr>
+      <w:r>
+        <w:rPr>
+          <w:rFonts w:ascii="DejaVu Sans Mono" w:hAnsi="DejaVu Sans Mono"/>
+          <w:sz w:val="18"/>
+        </w:rPr>
+        <w:t>if (!ContactValidator.isValidName(name)) {</w:t>
+      </w:r>
+    </w:p>
+    <w:p>
+      <w:pPr>
+        <w:keepNext/>
+        <w:spacing w:after="0" w:before="0" w:line="252" w:lineRule="auto"/>
+        <w:ind w:left="144"/>
+      </w:pPr>
+      <w:r>
+        <w:rPr>
+          <w:rFonts w:ascii="DejaVu Sans Mono" w:hAnsi="DejaVu Sans Mono"/>
+          <w:sz w:val="18"/>
+        </w:rPr>
+        <w:t xml:space="preserve">    nameInput.setError(getString(R.string.name_required)); nameInput.requestFocus(); return;</w:t>
+      </w:r>
+    </w:p>
+    <w:p>
+      <w:pPr>
+        <w:keepNext/>
+        <w:spacing w:after="0" w:before="0" w:line="252" w:lineRule="auto"/>
+        <w:ind w:left="144"/>
+      </w:pPr>
+      <w:r>
+        <w:rPr>
+          <w:rFonts w:ascii="DejaVu Sans Mono" w:hAnsi="DejaVu Sans Mono"/>
+          <w:sz w:val="18"/>
+        </w:rPr>
+        <w:t>}</w:t>
+      </w:r>
+    </w:p>
+    <w:p>
+      <w:pPr>
+        <w:keepNext/>
+        <w:spacing w:after="0" w:before="0" w:line="252" w:lineRule="auto"/>
+        <w:ind w:left="144"/>
+      </w:pPr>
+      <w:r>
+        <w:rPr>
+          <w:rFonts w:ascii="DejaVu Sans Mono" w:hAnsi="DejaVu Sans Mono"/>
+          <w:sz w:val="18"/>
+        </w:rPr>
+        <w:t>if (!ContactValidator.isValidPhone(phone)) {</w:t>
+      </w:r>
+    </w:p>
+    <w:p>
+      <w:pPr>
+        <w:keepNext/>
+        <w:spacing w:after="0" w:before="0" w:line="252" w:lineRule="auto"/>
+        <w:ind w:left="144"/>
+      </w:pPr>
+      <w:r>
+        <w:rPr>
+          <w:rFonts w:ascii="DejaVu Sans Mono" w:hAnsi="DejaVu Sans Mono"/>
+          <w:sz w:val="18"/>
+        </w:rPr>
+        <w:t xml:space="preserve">    phoneInput.setError(getString(R.string.phone_invalid)); phoneInput.requestFocus(); return;</w:t>
+      </w:r>
+    </w:p>
+    <w:p>
+      <w:pPr>
+        <w:keepNext/>
+        <w:spacing w:after="0" w:before="0" w:line="252" w:lineRule="auto"/>
+        <w:ind w:left="144"/>
+      </w:pPr>
+      <w:r>
+        <w:rPr>
+          <w:rFonts w:ascii="DejaVu Sans Mono" w:hAnsi="DejaVu Sans Mono"/>
+          <w:sz w:val="18"/>
+        </w:rPr>
+        <w:t>}</w:t>
+      </w:r>
+    </w:p>
+    <w:p>
+      <w:pPr>
+        <w:keepNext/>
+        <w:spacing w:after="0" w:before="0" w:line="252" w:lineRule="auto"/>
+        <w:ind w:left="144"/>
+      </w:pPr>
+      <w:r>
+        <w:rPr>
+          <w:rFonts w:ascii="DejaVu Sans Mono" w:hAnsi="DejaVu Sans Mono"/>
+          <w:sz w:val="18"/>
+        </w:rPr>
+        <w:t>ContactRepository repository = ContactRepository.getInstance();</w:t>
+      </w:r>
+    </w:p>
+    <w:p>
+      <w:pPr>
+        <w:keepNext/>
+        <w:spacing w:after="0" w:before="0" w:line="252" w:lineRule="auto"/>
+        <w:ind w:left="144"/>
+      </w:pPr>
+      <w:r>
+        <w:rPr>
+          <w:rFonts w:ascii="DejaVu Sans Mono" w:hAnsi="DejaVu Sans Mono"/>
+          <w:sz w:val="18"/>
+        </w:rPr>
+        <w:t>if (repository.containsPhone(phone)) {</w:t>
+      </w:r>
+    </w:p>
+    <w:p>
+      <w:pPr>
+        <w:keepNext/>
+        <w:spacing w:after="0" w:before="0" w:line="252" w:lineRule="auto"/>
+        <w:ind w:left="144"/>
+      </w:pPr>
+      <w:r>
+        <w:rPr>
+          <w:rFonts w:ascii="DejaVu Sans Mono" w:hAnsi="DejaVu Sans Mono"/>
+          <w:sz w:val="18"/>
+        </w:rPr>
+        <w:t xml:space="preserve">    phoneInput.setError(getString(R.string.phone_duplicate)); phoneInput.requestFocus(); return;</w:t>
+      </w:r>
+    </w:p>
+    <w:p>
+      <w:pPr>
+        <w:keepNext w:val="0"/>
+        <w:spacing w:after="0" w:before="0" w:line="252" w:lineRule="auto"/>
+        <w:ind w:left="144"/>
+      </w:pPr>
+      <w:r>
+        <w:rPr>
+          <w:rFonts w:ascii="DejaVu Sans Mono" w:hAnsi="DejaVu Sans Mono"/>
+          <w:sz w:val="18"/>
+        </w:rPr>
+        <w:t>}</w:t>
+      </w:r>
+    </w:p>
+    <w:p>
+      <w:pPr>
+        <w:pStyle w:val="Heading2"/>
+      </w:pPr>
+      <w:r>
+        <w:t>Quy tắc số điện thoại</w:t>
+      </w:r>
+    </w:p>
+    <w:p>
+      <w:pPr>
+        <w:pStyle w:val="Caption"/>
+        <w:spacing w:after="100"/>
+      </w:pPr>
+      <w:r>
+        <w:t>ContactValidator.java - dòng 8 đến 10</w:t>
+      </w:r>
+    </w:p>
+    <w:p>
+      <w:pPr>
+        <w:keepNext/>
+        <w:spacing w:after="0" w:before="0" w:line="252" w:lineRule="auto"/>
+        <w:ind w:left="144"/>
+      </w:pPr>
+      <w:r>
+        <w:rPr>
+          <w:rFonts w:ascii="DejaVu Sans Mono" w:hAnsi="DejaVu Sans Mono"/>
+          <w:sz w:val="18"/>
+        </w:rPr>
+        <w:t>public static boolean isValidPhone(String phone) {</w:t>
+      </w:r>
+    </w:p>
+    <w:p>
+      <w:pPr>
+        <w:keepNext/>
+        <w:spacing w:after="0" w:before="0" w:line="252" w:lineRule="auto"/>
+        <w:ind w:left="144"/>
+      </w:pPr>
+      <w:r>
+        <w:rPr>
+          <w:rFonts w:ascii="DejaVu Sans Mono" w:hAnsi="DejaVu Sans Mono"/>
+          <w:sz w:val="18"/>
+        </w:rPr>
+        <w:t xml:space="preserve">    return phone != null &amp;&amp; phone.trim().matches("0[0-9]{9}");</w:t>
+      </w:r>
+    </w:p>
+    <w:p>
+      <w:pPr>
+        <w:keepNext w:val="0"/>
+        <w:spacing w:after="0" w:before="0" w:line="252" w:lineRule="auto"/>
+        <w:ind w:left="144"/>
+      </w:pPr>
+      <w:r>
+        <w:rPr>
+          <w:rFonts w:ascii="DejaVu Sans Mono" w:hAnsi="DejaVu Sans Mono"/>
+          <w:sz w:val="18"/>
+        </w:rPr>
+        <w:t>}</w:t>
+      </w:r>
+    </w:p>
+    <w:p>
+      <w:pPr>
+        <w:pStyle w:val="Heading2"/>
+      </w:pPr>
+      <w:r>
+        <w:t>Tạo Contact và quay về danh sách</w:t>
+      </w:r>
+    </w:p>
+    <w:p>
+      <w:pPr>
+        <w:pStyle w:val="Caption"/>
+        <w:spacing w:after="100"/>
+      </w:pPr>
+      <w:r>
+        <w:t>AddContactActivity.java - dòng 56 đến 61</w:t>
+      </w:r>
+    </w:p>
+    <w:p>
+      <w:pPr>
+        <w:keepNext/>
+        <w:spacing w:after="0" w:before="0" w:line="252" w:lineRule="auto"/>
+        <w:ind w:left="144"/>
+      </w:pPr>
+      <w:r>
+        <w:rPr>
+          <w:rFonts w:ascii="DejaVu Sans Mono" w:hAnsi="DejaVu Sans Mono"/>
+          <w:sz w:val="18"/>
+        </w:rPr>
+        <w:t>Contact contact = new Contact(name, phone, group.getSelectedItem().toString(),</w:t>
+      </w:r>
+    </w:p>
+    <w:p>
+      <w:pPr>
+        <w:keepNext/>
+        <w:spacing w:after="0" w:before="0" w:line="252" w:lineRule="auto"/>
+        <w:ind w:left="144"/>
+      </w:pPr>
+      <w:r>
+        <w:rPr>
+          <w:rFonts w:ascii="DejaVu Sans Mono" w:hAnsi="DejaVu Sans Mono"/>
+          <w:sz w:val="18"/>
+        </w:rPr>
+        <w:t xml:space="preserve">        selected.getText().toString(), favorite.isChecked(), notes.getText().toString());</w:t>
+      </w:r>
+    </w:p>
+    <w:p>
+      <w:pPr>
+        <w:keepNext/>
+        <w:spacing w:after="0" w:before="0" w:line="252" w:lineRule="auto"/>
+        <w:ind w:left="144"/>
+      </w:pPr>
+      <w:r>
+        <w:rPr>
+          <w:rFonts w:ascii="DejaVu Sans Mono" w:hAnsi="DejaVu Sans Mono"/>
+          <w:sz w:val="18"/>
+        </w:rPr>
+        <w:t>if (repository.add(contact)) {</w:t>
+      </w:r>
+    </w:p>
+    <w:p>
+      <w:pPr>
+        <w:keepNext/>
+        <w:spacing w:after="0" w:before="0" w:line="252" w:lineRule="auto"/>
+        <w:ind w:left="144"/>
+      </w:pPr>
+      <w:r>
+        <w:rPr>
+          <w:rFonts w:ascii="DejaVu Sans Mono" w:hAnsi="DejaVu Sans Mono"/>
+          <w:sz w:val="18"/>
+        </w:rPr>
+        <w:t xml:space="preserve">    Toast.makeText(this, R.string.saved, Toast.LENGTH_SHORT).show();</w:t>
+      </w:r>
+    </w:p>
+    <w:p>
+      <w:pPr>
+        <w:keepNext/>
+        <w:spacing w:after="0" w:before="0" w:line="252" w:lineRule="auto"/>
+        <w:ind w:left="144"/>
+      </w:pPr>
+      <w:r>
+        <w:rPr>
+          <w:rFonts w:ascii="DejaVu Sans Mono" w:hAnsi="DejaVu Sans Mono"/>
+          <w:sz w:val="18"/>
+        </w:rPr>
+        <w:t xml:space="preserve">    finish();</w:t>
+      </w:r>
+    </w:p>
+    <w:p>
+      <w:pPr>
+        <w:keepNext w:val="0"/>
+        <w:spacing w:after="0" w:before="0" w:line="252" w:lineRule="auto"/>
+        <w:ind w:left="144"/>
+      </w:pPr>
+      <w:r>
+        <w:rPr>
+          <w:rFonts w:ascii="DejaVu Sans Mono" w:hAnsi="DejaVu Sans Mono"/>
+          <w:sz w:val="18"/>
+        </w:rPr>
+        <w:t>}</w:t>
+      </w:r>
+    </w:p>
+    <w:p>
+      <w:pPr>
+        <w:spacing w:before="120"/>
+      </w:pPr>
+      <w:r>
+        <w:t>save() đọc tên, điện thoại, Spinner, RadioGroup, CheckBox và ghi chú trước khi tạo đối tượng. Nhánh lỗi gọi return nên không thêm dữ liệu. Hàm validator chỉ chấp nhận đúng 10 chữ số ASCII, chữ số đầu là 0; containsPhone() kiểm tra trên toàn bộ danh bạ.</w:t>
+      </w:r>
+    </w:p>
+    <w:p>
+      <w:r>
+        <w:br w:type="page"/>
+      </w:r>
+    </w:p>
+    <w:p>
+      <w:pPr>
+        <w:pStyle w:val="Heading1"/>
+      </w:pPr>
+      <w:r>
         <w:t>6 Chi tiết liên hệ ContactDetailActivity</w:t>
       </w:r>
     </w:p>
@@ -940,6 +1875,400 @@
         <w:pStyle w:val="Heading1"/>
       </w:pPr>
       <w:r>
+        <w:t>Mã tiêu biểu của màn hình chi tiết</w:t>
+      </w:r>
+    </w:p>
+    <w:p>
+      <w:pPr>
+        <w:pStyle w:val="Heading2"/>
+      </w:pPr>
+      <w:r>
+        <w:t>Nhận liên hệ qua Intent</w:t>
+      </w:r>
+    </w:p>
+    <w:p>
+      <w:pPr>
+        <w:pStyle w:val="Caption"/>
+        <w:spacing w:after="100"/>
+      </w:pPr>
+      <w:r>
+        <w:t>ContactDetailActivity.java - dòng 19 đến 23</w:t>
+      </w:r>
+    </w:p>
+    <w:p>
+      <w:pPr>
+        <w:keepNext/>
+        <w:spacing w:after="0" w:before="0" w:line="252" w:lineRule="auto"/>
+        <w:ind w:left="144"/>
+      </w:pPr>
+      <w:r>
+        <w:rPr>
+          <w:rFonts w:ascii="DejaVu Sans Mono" w:hAnsi="DejaVu Sans Mono"/>
+          <w:sz w:val="18"/>
+        </w:rPr>
+        <w:t>Contact received = IntentCompat.getSerializableExtra(getIntent(), EXTRA_CONTACT, Contact.class);</w:t>
+      </w:r>
+    </w:p>
+    <w:p>
+      <w:pPr>
+        <w:keepNext/>
+        <w:spacing w:after="0" w:before="0" w:line="252" w:lineRule="auto"/>
+        <w:ind w:left="144"/>
+      </w:pPr>
+      <w:r>
+        <w:rPr>
+          <w:rFonts w:ascii="DejaVu Sans Mono" w:hAnsi="DejaVu Sans Mono"/>
+          <w:sz w:val="18"/>
+        </w:rPr>
+        <w:t>contact = received == null ? null : ContactRepository.getInstance().findById(received.getId());</w:t>
+      </w:r>
+    </w:p>
+    <w:p>
+      <w:pPr>
+        <w:keepNext/>
+        <w:spacing w:after="0" w:before="0" w:line="252" w:lineRule="auto"/>
+        <w:ind w:left="144"/>
+      </w:pPr>
+      <w:r>
+        <w:rPr>
+          <w:rFonts w:ascii="DejaVu Sans Mono" w:hAnsi="DejaVu Sans Mono"/>
+          <w:sz w:val="18"/>
+        </w:rPr>
+        <w:t>if (contact == null) {</w:t>
+      </w:r>
+    </w:p>
+    <w:p>
+      <w:pPr>
+        <w:keepNext/>
+        <w:spacing w:after="0" w:before="0" w:line="252" w:lineRule="auto"/>
+        <w:ind w:left="144"/>
+      </w:pPr>
+      <w:r>
+        <w:rPr>
+          <w:rFonts w:ascii="DejaVu Sans Mono" w:hAnsi="DejaVu Sans Mono"/>
+          <w:sz w:val="18"/>
+        </w:rPr>
+        <w:t xml:space="preserve">    Toast.makeText(this, R.string.missing_contact, Toast.LENGTH_SHORT).show(); finish(); return;</w:t>
+      </w:r>
+    </w:p>
+    <w:p>
+      <w:pPr>
+        <w:keepNext w:val="0"/>
+        <w:spacing w:after="0" w:before="0" w:line="252" w:lineRule="auto"/>
+        <w:ind w:left="144"/>
+      </w:pPr>
+      <w:r>
+        <w:rPr>
+          <w:rFonts w:ascii="DejaVu Sans Mono" w:hAnsi="DejaVu Sans Mono"/>
+          <w:sz w:val="18"/>
+        </w:rPr>
+        <w:t>}</w:t>
+      </w:r>
+    </w:p>
+    <w:p>
+      <w:pPr>
+        <w:pStyle w:val="Heading2"/>
+      </w:pPr>
+      <w:r>
+        <w:t>Đổi yêu thích và mở trình quay số</w:t>
+      </w:r>
+    </w:p>
+    <w:p>
+      <w:pPr>
+        <w:pStyle w:val="Caption"/>
+        <w:spacing w:after="100"/>
+      </w:pPr>
+      <w:r>
+        <w:t>ContactDetailActivity.java - dòng 31 đến 40</w:t>
+      </w:r>
+    </w:p>
+    <w:p>
+      <w:pPr>
+        <w:keepNext/>
+        <w:spacing w:after="0" w:before="0" w:line="252" w:lineRule="auto"/>
+        <w:ind w:left="144"/>
+      </w:pPr>
+      <w:r>
+        <w:rPr>
+          <w:rFonts w:ascii="DejaVu Sans Mono" w:hAnsi="DejaVu Sans Mono"/>
+          <w:sz w:val="18"/>
+        </w:rPr>
+        <w:t>CheckBox favorite = findViewById(R.id.detailFavorite);</w:t>
+      </w:r>
+    </w:p>
+    <w:p>
+      <w:pPr>
+        <w:keepNext/>
+        <w:spacing w:after="0" w:before="0" w:line="252" w:lineRule="auto"/>
+        <w:ind w:left="144"/>
+      </w:pPr>
+      <w:r>
+        <w:rPr>
+          <w:rFonts w:ascii="DejaVu Sans Mono" w:hAnsi="DejaVu Sans Mono"/>
+          <w:sz w:val="18"/>
+        </w:rPr>
+        <w:t>favorite.setChecked(contact.isFavorite());</w:t>
+      </w:r>
+    </w:p>
+    <w:p>
+      <w:pPr>
+        <w:keepNext/>
+        <w:spacing w:after="0" w:before="0" w:line="252" w:lineRule="auto"/>
+        <w:ind w:left="144"/>
+      </w:pPr>
+      <w:r>
+        <w:rPr>
+          <w:rFonts w:ascii="DejaVu Sans Mono" w:hAnsi="DejaVu Sans Mono"/>
+          <w:sz w:val="18"/>
+        </w:rPr>
+        <w:t>favorite.setOnCheckedChangeListener((button, checked) -&gt; contact.setFavorite(checked));</w:t>
+      </w:r>
+    </w:p>
+    <w:p>
+      <w:pPr>
+        <w:keepNext/>
+        <w:spacing w:after="0" w:before="0" w:line="252" w:lineRule="auto"/>
+        <w:ind w:left="144"/>
+      </w:pPr>
+      <w:r>
+        <w:rPr>
+          <w:rFonts w:ascii="DejaVu Sans Mono" w:hAnsi="DejaVu Sans Mono"/>
+          <w:sz w:val="18"/>
+        </w:rPr>
+        <w:t>findViewById(R.id.callButton).setOnClickListener(view -&gt; {</w:t>
+      </w:r>
+    </w:p>
+    <w:p>
+      <w:pPr>
+        <w:keepNext/>
+        <w:spacing w:after="0" w:before="0" w:line="252" w:lineRule="auto"/>
+        <w:ind w:left="144"/>
+      </w:pPr>
+      <w:r>
+        <w:rPr>
+          <w:rFonts w:ascii="DejaVu Sans Mono" w:hAnsi="DejaVu Sans Mono"/>
+          <w:sz w:val="18"/>
+        </w:rPr>
+        <w:t xml:space="preserve">    Intent dial = new Intent(Intent.ACTION_DIAL, Uri.fromParts("tel", contact.getPhone(), null));</w:t>
+      </w:r>
+    </w:p>
+    <w:p>
+      <w:pPr>
+        <w:keepNext/>
+        <w:spacing w:after="0" w:before="0" w:line="252" w:lineRule="auto"/>
+        <w:ind w:left="144"/>
+      </w:pPr>
+      <w:r>
+        <w:rPr>
+          <w:rFonts w:ascii="DejaVu Sans Mono" w:hAnsi="DejaVu Sans Mono"/>
+          <w:sz w:val="18"/>
+        </w:rPr>
+        <w:t xml:space="preserve">    try { startActivity(dial); }</w:t>
+      </w:r>
+    </w:p>
+    <w:p>
+      <w:pPr>
+        <w:keepNext/>
+        <w:spacing w:after="0" w:before="0" w:line="252" w:lineRule="auto"/>
+        <w:ind w:left="144"/>
+      </w:pPr>
+      <w:r>
+        <w:rPr>
+          <w:rFonts w:ascii="DejaVu Sans Mono" w:hAnsi="DejaVu Sans Mono"/>
+          <w:sz w:val="18"/>
+        </w:rPr>
+        <w:t xml:space="preserve">    catch (ActivityNotFoundException exception) {</w:t>
+      </w:r>
+    </w:p>
+    <w:p>
+      <w:pPr>
+        <w:keepNext/>
+        <w:spacing w:after="0" w:before="0" w:line="252" w:lineRule="auto"/>
+        <w:ind w:left="144"/>
+      </w:pPr>
+      <w:r>
+        <w:rPr>
+          <w:rFonts w:ascii="DejaVu Sans Mono" w:hAnsi="DejaVu Sans Mono"/>
+          <w:sz w:val="18"/>
+        </w:rPr>
+        <w:t xml:space="preserve">        Toast.makeText(this, R.string.dial_unavailable, Toast.LENGTH_SHORT).show();</w:t>
+      </w:r>
+    </w:p>
+    <w:p>
+      <w:pPr>
+        <w:keepNext/>
+        <w:spacing w:after="0" w:before="0" w:line="252" w:lineRule="auto"/>
+        <w:ind w:left="144"/>
+      </w:pPr>
+      <w:r>
+        <w:rPr>
+          <w:rFonts w:ascii="DejaVu Sans Mono" w:hAnsi="DejaVu Sans Mono"/>
+          <w:sz w:val="18"/>
+        </w:rPr>
+        <w:t xml:space="preserve">    }</w:t>
+      </w:r>
+    </w:p>
+    <w:p>
+      <w:pPr>
+        <w:keepNext w:val="0"/>
+        <w:spacing w:after="0" w:before="0" w:line="252" w:lineRule="auto"/>
+        <w:ind w:left="144"/>
+      </w:pPr>
+      <w:r>
+        <w:rPr>
+          <w:rFonts w:ascii="DejaVu Sans Mono" w:hAnsi="DejaVu Sans Mono"/>
+          <w:sz w:val="18"/>
+        </w:rPr>
+        <w:t>});</w:t>
+      </w:r>
+    </w:p>
+    <w:p>
+      <w:pPr>
+        <w:pStyle w:val="Heading2"/>
+      </w:pPr>
+      <w:r>
+        <w:t>Xác nhận xóa khỏi ArrayList</w:t>
+      </w:r>
+    </w:p>
+    <w:p>
+      <w:pPr>
+        <w:pStyle w:val="Caption"/>
+        <w:spacing w:after="100"/>
+      </w:pPr>
+      <w:r>
+        <w:t>ContactDetailActivity.java - dòng 41 đến 48</w:t>
+      </w:r>
+    </w:p>
+    <w:p>
+      <w:pPr>
+        <w:keepNext/>
+        <w:spacing w:after="0" w:before="0" w:line="252" w:lineRule="auto"/>
+        <w:ind w:left="144"/>
+      </w:pPr>
+      <w:r>
+        <w:rPr>
+          <w:rFonts w:ascii="DejaVu Sans Mono" w:hAnsi="DejaVu Sans Mono"/>
+          <w:sz w:val="18"/>
+        </w:rPr>
+        <w:t>findViewById(R.id.deleteButton).setOnClickListener(view -&gt; new AlertDialog.Builder(this)</w:t>
+      </w:r>
+    </w:p>
+    <w:p>
+      <w:pPr>
+        <w:keepNext/>
+        <w:spacing w:after="0" w:before="0" w:line="252" w:lineRule="auto"/>
+        <w:ind w:left="144"/>
+      </w:pPr>
+      <w:r>
+        <w:rPr>
+          <w:rFonts w:ascii="DejaVu Sans Mono" w:hAnsi="DejaVu Sans Mono"/>
+          <w:sz w:val="18"/>
+        </w:rPr>
+        <w:t xml:space="preserve">        .setTitle(R.string.delete_title)</w:t>
+      </w:r>
+    </w:p>
+    <w:p>
+      <w:pPr>
+        <w:keepNext/>
+        <w:spacing w:after="0" w:before="0" w:line="252" w:lineRule="auto"/>
+        <w:ind w:left="144"/>
+      </w:pPr>
+      <w:r>
+        <w:rPr>
+          <w:rFonts w:ascii="DejaVu Sans Mono" w:hAnsi="DejaVu Sans Mono"/>
+          <w:sz w:val="18"/>
+        </w:rPr>
+        <w:t xml:space="preserve">        .setMessage(getString(R.string.delete_message, contact.getFullName()))</w:t>
+      </w:r>
+    </w:p>
+    <w:p>
+      <w:pPr>
+        <w:keepNext/>
+        <w:spacing w:after="0" w:before="0" w:line="252" w:lineRule="auto"/>
+        <w:ind w:left="144"/>
+      </w:pPr>
+      <w:r>
+        <w:rPr>
+          <w:rFonts w:ascii="DejaVu Sans Mono" w:hAnsi="DejaVu Sans Mono"/>
+          <w:sz w:val="18"/>
+        </w:rPr>
+        <w:t xml:space="preserve">        .setNegativeButton(R.string.cancel, null)</w:t>
+      </w:r>
+    </w:p>
+    <w:p>
+      <w:pPr>
+        <w:keepNext/>
+        <w:spacing w:after="0" w:before="0" w:line="252" w:lineRule="auto"/>
+        <w:ind w:left="144"/>
+      </w:pPr>
+      <w:r>
+        <w:rPr>
+          <w:rFonts w:ascii="DejaVu Sans Mono" w:hAnsi="DejaVu Sans Mono"/>
+          <w:sz w:val="18"/>
+        </w:rPr>
+        <w:t xml:space="preserve">        .setPositiveButton(R.string.delete_contact, (dialog, which) -&gt; {</w:t>
+      </w:r>
+    </w:p>
+    <w:p>
+      <w:pPr>
+        <w:keepNext/>
+        <w:spacing w:after="0" w:before="0" w:line="252" w:lineRule="auto"/>
+        <w:ind w:left="144"/>
+      </w:pPr>
+      <w:r>
+        <w:rPr>
+          <w:rFonts w:ascii="DejaVu Sans Mono" w:hAnsi="DejaVu Sans Mono"/>
+          <w:sz w:val="18"/>
+        </w:rPr>
+        <w:t xml:space="preserve">            ContactRepository.getInstance().delete(contact.getId());</w:t>
+      </w:r>
+    </w:p>
+    <w:p>
+      <w:pPr>
+        <w:keepNext/>
+        <w:spacing w:after="0" w:before="0" w:line="252" w:lineRule="auto"/>
+        <w:ind w:left="144"/>
+      </w:pPr>
+      <w:r>
+        <w:rPr>
+          <w:rFonts w:ascii="DejaVu Sans Mono" w:hAnsi="DejaVu Sans Mono"/>
+          <w:sz w:val="18"/>
+        </w:rPr>
+        <w:t xml:space="preserve">            Toast.makeText(this, R.string.deleted, Toast.LENGTH_SHORT).show(); finish();</w:t>
+      </w:r>
+    </w:p>
+    <w:p>
+      <w:pPr>
+        <w:keepNext w:val="0"/>
+        <w:spacing w:after="0" w:before="0" w:line="252" w:lineRule="auto"/>
+        <w:ind w:left="144"/>
+      </w:pPr>
+      <w:r>
+        <w:rPr>
+          <w:rFonts w:ascii="DejaVu Sans Mono" w:hAnsi="DejaVu Sans Mono"/>
+          <w:sz w:val="18"/>
+        </w:rPr>
+        <w:t xml:space="preserve">        }).show());</w:t>
+      </w:r>
+    </w:p>
+    <w:p>
+      <w:pPr>
+        <w:spacing w:before="120"/>
+      </w:pPr>
+      <w:r>
+        <w:t>BaseActivity gắn nút backButton với finish(). Khi xóa, repository.delete(id) loại đối tượng khỏi ArrayList; MainActivity.onResume() cập nhật danh sách và thống kê. Khi thiết bị thiếu trình quay số, ActivityNotFoundException được xử lý bằng Toast.</w:t>
+      </w:r>
+    </w:p>
+    <w:p>
+      <w:r>
+        <w:br w:type="page"/>
+      </w:r>
+    </w:p>
+    <w:p>
+      <w:pPr>
+        <w:pStyle w:val="Heading1"/>
+      </w:pPr>
+      <w:r>
         <w:t>7 Xóa liên hệ và cập nhật thống kê</w:t>
       </w:r>
     </w:p>
@@ -1043,6 +2372,690 @@
       </w:pPr>
       <w:r>
         <w:t>Trong kịch bản kiểm thử, Nguyễn Văn An được đánh dấu yêu thích trước khi xóa: thống kê tăng từ 1 lên 2 yêu thích. Hủy hộp thoại vẫn còn 3 liên hệ; xác nhận xóa còn 2 liên hệ và 1 yêu thích. Đây là dữ liệu mẫu được khởi tạo độc lập cho kịch bản, khác với danh sách 4 liên hệ ở Hình 4.</w:t>
+      </w:r>
+    </w:p>
+    <w:p>
+      <w:r>
+        <w:br w:type="page"/>
+      </w:r>
+    </w:p>
+    <w:p>
+      <w:pPr>
+        <w:pStyle w:val="Heading1"/>
+      </w:pPr>
+      <w:r>
+        <w:t>Mô hình dữ liệu và các thành phần XML</w:t>
+      </w:r>
+    </w:p>
+    <w:p>
+      <w:pPr>
+        <w:pStyle w:val="Heading2"/>
+      </w:pPr>
+      <w:r>
+        <w:t>Lớp Contact chứa đủ các trường của đề</w:t>
+      </w:r>
+    </w:p>
+    <w:p>
+      <w:pPr>
+        <w:pStyle w:val="Caption"/>
+        <w:spacing w:after="100"/>
+      </w:pPr>
+      <w:r>
+        <w:t>Contact.java - dòng 8 đến 16</w:t>
+      </w:r>
+    </w:p>
+    <w:p>
+      <w:pPr>
+        <w:keepNext/>
+        <w:spacing w:after="0" w:before="0" w:line="252" w:lineRule="auto"/>
+        <w:ind w:left="144"/>
+      </w:pPr>
+      <w:r>
+        <w:rPr>
+          <w:rFonts w:ascii="DejaVu Sans Mono" w:hAnsi="DejaVu Sans Mono"/>
+          <w:sz w:val="18"/>
+        </w:rPr>
+        <w:t>public class Contact implements Serializable {</w:t>
+      </w:r>
+    </w:p>
+    <w:p>
+      <w:pPr>
+        <w:keepNext/>
+        <w:spacing w:after="0" w:before="0" w:line="252" w:lineRule="auto"/>
+        <w:ind w:left="144"/>
+      </w:pPr>
+      <w:r>
+        <w:rPr>
+          <w:rFonts w:ascii="DejaVu Sans Mono" w:hAnsi="DejaVu Sans Mono"/>
+          <w:sz w:val="18"/>
+        </w:rPr>
+        <w:t xml:space="preserve">    private static final long serialVersionUID = 1L;</w:t>
+      </w:r>
+    </w:p>
+    <w:p>
+      <w:pPr>
+        <w:keepNext/>
+        <w:spacing w:after="0" w:before="0" w:line="252" w:lineRule="auto"/>
+        <w:ind w:left="144"/>
+      </w:pPr>
+      <w:r>
+        <w:rPr>
+          <w:rFonts w:ascii="DejaVu Sans Mono" w:hAnsi="DejaVu Sans Mono"/>
+          <w:sz w:val="18"/>
+        </w:rPr>
+        <w:t xml:space="preserve">    private final String id;</w:t>
+      </w:r>
+    </w:p>
+    <w:p>
+      <w:pPr>
+        <w:keepNext/>
+        <w:spacing w:after="0" w:before="0" w:line="252" w:lineRule="auto"/>
+        <w:ind w:left="144"/>
+      </w:pPr>
+      <w:r>
+        <w:rPr>
+          <w:rFonts w:ascii="DejaVu Sans Mono" w:hAnsi="DejaVu Sans Mono"/>
+          <w:sz w:val="18"/>
+        </w:rPr>
+        <w:t xml:space="preserve">    private final String fullName;</w:t>
+      </w:r>
+    </w:p>
+    <w:p>
+      <w:pPr>
+        <w:keepNext/>
+        <w:spacing w:after="0" w:before="0" w:line="252" w:lineRule="auto"/>
+        <w:ind w:left="144"/>
+      </w:pPr>
+      <w:r>
+        <w:rPr>
+          <w:rFonts w:ascii="DejaVu Sans Mono" w:hAnsi="DejaVu Sans Mono"/>
+          <w:sz w:val="18"/>
+        </w:rPr>
+        <w:t xml:space="preserve">    private final String phone;</w:t>
+      </w:r>
+    </w:p>
+    <w:p>
+      <w:pPr>
+        <w:keepNext/>
+        <w:spacing w:after="0" w:before="0" w:line="252" w:lineRule="auto"/>
+        <w:ind w:left="144"/>
+      </w:pPr>
+      <w:r>
+        <w:rPr>
+          <w:rFonts w:ascii="DejaVu Sans Mono" w:hAnsi="DejaVu Sans Mono"/>
+          <w:sz w:val="18"/>
+        </w:rPr>
+        <w:t xml:space="preserve">    private final String group;</w:t>
+      </w:r>
+    </w:p>
+    <w:p>
+      <w:pPr>
+        <w:keepNext/>
+        <w:spacing w:after="0" w:before="0" w:line="252" w:lineRule="auto"/>
+        <w:ind w:left="144"/>
+      </w:pPr>
+      <w:r>
+        <w:rPr>
+          <w:rFonts w:ascii="DejaVu Sans Mono" w:hAnsi="DejaVu Sans Mono"/>
+          <w:sz w:val="18"/>
+        </w:rPr>
+        <w:t xml:space="preserve">    private final String gender;</w:t>
+      </w:r>
+    </w:p>
+    <w:p>
+      <w:pPr>
+        <w:keepNext/>
+        <w:spacing w:after="0" w:before="0" w:line="252" w:lineRule="auto"/>
+        <w:ind w:left="144"/>
+      </w:pPr>
+      <w:r>
+        <w:rPr>
+          <w:rFonts w:ascii="DejaVu Sans Mono" w:hAnsi="DejaVu Sans Mono"/>
+          <w:sz w:val="18"/>
+        </w:rPr>
+        <w:t xml:space="preserve">    private boolean favorite;</w:t>
+      </w:r>
+    </w:p>
+    <w:p>
+      <w:pPr>
+        <w:keepNext w:val="0"/>
+        <w:spacing w:after="0" w:before="0" w:line="252" w:lineRule="auto"/>
+        <w:ind w:left="144"/>
+      </w:pPr>
+      <w:r>
+        <w:rPr>
+          <w:rFonts w:ascii="DejaVu Sans Mono" w:hAnsi="DejaVu Sans Mono"/>
+          <w:sz w:val="18"/>
+        </w:rPr>
+        <w:t xml:space="preserve">    private final String notes;</w:t>
+      </w:r>
+    </w:p>
+    <w:p>
+      <w:pPr>
+        <w:pStyle w:val="Heading2"/>
+      </w:pPr>
+      <w:r>
+        <w:t>ArrayList và ba liên hệ mẫu</w:t>
+      </w:r>
+    </w:p>
+    <w:p>
+      <w:pPr>
+        <w:pStyle w:val="Caption"/>
+        <w:spacing w:after="100"/>
+      </w:pPr>
+      <w:r>
+        <w:t>ContactRepository.java - dòng 8 đến 13</w:t>
+      </w:r>
+    </w:p>
+    <w:p>
+      <w:pPr>
+        <w:keepNext/>
+        <w:spacing w:after="0" w:before="0" w:line="252" w:lineRule="auto"/>
+        <w:ind w:left="144"/>
+      </w:pPr>
+      <w:r>
+        <w:rPr>
+          <w:rFonts w:ascii="DejaVu Sans Mono" w:hAnsi="DejaVu Sans Mono"/>
+          <w:sz w:val="18"/>
+        </w:rPr>
+        <w:t>private final ArrayList&lt;Contact&gt; contacts = new ArrayList&lt;&gt;();</w:t>
+      </w:r>
+    </w:p>
+    <w:p>
+      <w:pPr>
+        <w:keepNext/>
+        <w:spacing w:after="0" w:before="0" w:line="252" w:lineRule="auto"/>
+        <w:ind w:left="144"/>
+      </w:pPr>
+      <w:r>
+        <w:rPr>
+          <w:rFonts w:ascii="DejaVu Sans Mono" w:hAnsi="DejaVu Sans Mono"/>
+          <w:sz w:val="18"/>
+        </w:rPr>
+        <w:t>ContactRepository() {</w:t>
+      </w:r>
+    </w:p>
+    <w:p>
+      <w:pPr>
+        <w:keepNext/>
+        <w:spacing w:after="0" w:before="0" w:line="252" w:lineRule="auto"/>
+        <w:ind w:left="144"/>
+      </w:pPr>
+      <w:r>
+        <w:rPr>
+          <w:rFonts w:ascii="DejaVu Sans Mono" w:hAnsi="DejaVu Sans Mono"/>
+          <w:sz w:val="18"/>
+        </w:rPr>
+        <w:t xml:space="preserve">    contacts.add(new Contact("Nguyễn Văn An", "0901234567", "Bạn bè", "Nam", false, ""));</w:t>
+      </w:r>
+    </w:p>
+    <w:p>
+      <w:pPr>
+        <w:keepNext/>
+        <w:spacing w:after="0" w:before="0" w:line="252" w:lineRule="auto"/>
+        <w:ind w:left="144"/>
+      </w:pPr>
+      <w:r>
+        <w:rPr>
+          <w:rFonts w:ascii="DejaVu Sans Mono" w:hAnsi="DejaVu Sans Mono"/>
+          <w:sz w:val="18"/>
+        </w:rPr>
+        <w:t xml:space="preserve">    contacts.add(new Contact("Trần Thị Bình", "0912345678", "Gia đình", "Nữ", true, ""));</w:t>
+      </w:r>
+    </w:p>
+    <w:p>
+      <w:pPr>
+        <w:keepNext/>
+        <w:spacing w:after="0" w:before="0" w:line="252" w:lineRule="auto"/>
+        <w:ind w:left="144"/>
+      </w:pPr>
+      <w:r>
+        <w:rPr>
+          <w:rFonts w:ascii="DejaVu Sans Mono" w:hAnsi="DejaVu Sans Mono"/>
+          <w:sz w:val="18"/>
+        </w:rPr>
+        <w:t xml:space="preserve">    contacts.add(new Contact("Lê Minh Châu", "0987654321", "Công việc", "Nam", false, ""));</w:t>
+      </w:r>
+    </w:p>
+    <w:p>
+      <w:pPr>
+        <w:keepNext w:val="0"/>
+        <w:spacing w:after="0" w:before="0" w:line="252" w:lineRule="auto"/>
+        <w:ind w:left="144"/>
+      </w:pPr>
+      <w:r>
+        <w:rPr>
+          <w:rFonts w:ascii="DejaVu Sans Mono" w:hAnsi="DejaVu Sans Mono"/>
+          <w:sz w:val="18"/>
+        </w:rPr>
+        <w:t>}</w:t>
+      </w:r>
+    </w:p>
+    <w:p>
+      <w:pPr>
+        <w:pStyle w:val="Heading2"/>
+      </w:pPr>
+      <w:r>
+        <w:t>Đếm số liên hệ yêu thích</w:t>
+      </w:r>
+    </w:p>
+    <w:p>
+      <w:pPr>
+        <w:pStyle w:val="Caption"/>
+        <w:spacing w:after="100"/>
+      </w:pPr>
+      <w:r>
+        <w:t>ContactRepository.java - dòng 32 đến 36</w:t>
+      </w:r>
+    </w:p>
+    <w:p>
+      <w:pPr>
+        <w:keepNext/>
+        <w:spacing w:after="0" w:before="0" w:line="252" w:lineRule="auto"/>
+        <w:ind w:left="144"/>
+      </w:pPr>
+      <w:r>
+        <w:rPr>
+          <w:rFonts w:ascii="DejaVu Sans Mono" w:hAnsi="DejaVu Sans Mono"/>
+          <w:sz w:val="18"/>
+        </w:rPr>
+        <w:t>public int getFavoriteCount() {</w:t>
+      </w:r>
+    </w:p>
+    <w:p>
+      <w:pPr>
+        <w:keepNext/>
+        <w:spacing w:after="0" w:before="0" w:line="252" w:lineRule="auto"/>
+        <w:ind w:left="144"/>
+      </w:pPr>
+      <w:r>
+        <w:rPr>
+          <w:rFonts w:ascii="DejaVu Sans Mono" w:hAnsi="DejaVu Sans Mono"/>
+          <w:sz w:val="18"/>
+        </w:rPr>
+        <w:t xml:space="preserve">    int count = 0;</w:t>
+      </w:r>
+    </w:p>
+    <w:p>
+      <w:pPr>
+        <w:keepNext/>
+        <w:spacing w:after="0" w:before="0" w:line="252" w:lineRule="auto"/>
+        <w:ind w:left="144"/>
+      </w:pPr>
+      <w:r>
+        <w:rPr>
+          <w:rFonts w:ascii="DejaVu Sans Mono" w:hAnsi="DejaVu Sans Mono"/>
+          <w:sz w:val="18"/>
+        </w:rPr>
+        <w:t xml:space="preserve">    for (Contact contact : contacts) if (contact.isFavorite()) count++;</w:t>
+      </w:r>
+    </w:p>
+    <w:p>
+      <w:pPr>
+        <w:keepNext/>
+        <w:spacing w:after="0" w:before="0" w:line="252" w:lineRule="auto"/>
+        <w:ind w:left="144"/>
+      </w:pPr>
+      <w:r>
+        <w:rPr>
+          <w:rFonts w:ascii="DejaVu Sans Mono" w:hAnsi="DejaVu Sans Mono"/>
+          <w:sz w:val="18"/>
+        </w:rPr>
+        <w:t xml:space="preserve">    return count;</w:t>
+      </w:r>
+    </w:p>
+    <w:p>
+      <w:pPr>
+        <w:keepNext w:val="0"/>
+        <w:spacing w:after="0" w:before="0" w:line="252" w:lineRule="auto"/>
+        <w:ind w:left="144"/>
+      </w:pPr>
+      <w:r>
+        <w:rPr>
+          <w:rFonts w:ascii="DejaVu Sans Mono" w:hAnsi="DejaVu Sans Mono"/>
+          <w:sz w:val="18"/>
+        </w:rPr>
+        <w:t>}</w:t>
+      </w:r>
+    </w:p>
+    <w:p>
+      <w:pPr>
+        <w:spacing w:before="120"/>
+      </w:pPr>
+      <w:r>
+        <w:t>Các thuộc tính XML tiêu biểu được trích ở trang kế tiếp. RadioGroup mặc định chọn genderMale; Spinner lấy đủ bốn nhóm từ contact_groups. Tên và điện thoại là bắt buộc, còn ghi chú là tùy chọn.</w:t>
+      </w:r>
+    </w:p>
+    <w:p>
+      <w:r>
+        <w:br w:type="page"/>
+      </w:r>
+    </w:p>
+    <w:p>
+      <w:pPr>
+        <w:pStyle w:val="Heading1"/>
+      </w:pPr>
+      <w:r>
+        <w:t>Trích đoạn XML của các trường nhập liệu</w:t>
+      </w:r>
+    </w:p>
+    <w:p>
+      <w:pPr>
+        <w:pStyle w:val="Heading2"/>
+      </w:pPr>
+      <w:r>
+        <w:t>Mật khẩu được ẩn khi nhập</w:t>
+      </w:r>
+    </w:p>
+    <w:p>
+      <w:pPr>
+        <w:pStyle w:val="Caption"/>
+      </w:pPr>
+      <w:r>
+        <w:t>app/src/main/res/layout/activity_login.xml</w:t>
+      </w:r>
+    </w:p>
+    <w:p>
+      <w:pPr>
+        <w:keepNext/>
+        <w:spacing w:after="0"/>
+      </w:pPr>
+      <w:r>
+        <w:rPr>
+          <w:rFonts w:ascii="DejaVu Sans Mono" w:hAnsi="DejaVu Sans Mono"/>
+          <w:sz w:val="18"/>
+        </w:rPr>
+        <w:t>&lt;EditText</w:t>
+      </w:r>
+    </w:p>
+    <w:p>
+      <w:pPr>
+        <w:keepNext/>
+        <w:spacing w:after="0"/>
+      </w:pPr>
+      <w:r>
+        <w:rPr>
+          <w:rFonts w:ascii="DejaVu Sans Mono" w:hAnsi="DejaVu Sans Mono"/>
+          <w:sz w:val="18"/>
+        </w:rPr>
+        <w:t xml:space="preserve">    android:id="@+id/passwordInput"</w:t>
+      </w:r>
+    </w:p>
+    <w:p>
+      <w:pPr>
+        <w:keepNext w:val="0"/>
+        <w:spacing w:after="0"/>
+      </w:pPr>
+      <w:r>
+        <w:rPr>
+          <w:rFonts w:ascii="DejaVu Sans Mono" w:hAnsi="DejaVu Sans Mono"/>
+          <w:sz w:val="18"/>
+        </w:rPr>
+        <w:t xml:space="preserve">    android:inputType="textPassword" /&gt;</w:t>
+      </w:r>
+    </w:p>
+    <w:p>
+      <w:pPr>
+        <w:pStyle w:val="Heading2"/>
+      </w:pPr>
+      <w:r>
+        <w:t>Điện thoại chỉ cho nhập các chữ số</w:t>
+      </w:r>
+    </w:p>
+    <w:p>
+      <w:pPr>
+        <w:pStyle w:val="Caption"/>
+      </w:pPr>
+      <w:r>
+        <w:t>app/src/main/res/layout/activity_add_contact.xml</w:t>
+      </w:r>
+    </w:p>
+    <w:p>
+      <w:pPr>
+        <w:keepNext/>
+        <w:spacing w:after="0"/>
+      </w:pPr>
+      <w:r>
+        <w:rPr>
+          <w:rFonts w:ascii="DejaVu Sans Mono" w:hAnsi="DejaVu Sans Mono"/>
+          <w:sz w:val="18"/>
+        </w:rPr>
+        <w:t>&lt;EditText</w:t>
+      </w:r>
+    </w:p>
+    <w:p>
+      <w:pPr>
+        <w:keepNext/>
+        <w:spacing w:after="0"/>
+      </w:pPr>
+      <w:r>
+        <w:rPr>
+          <w:rFonts w:ascii="DejaVu Sans Mono" w:hAnsi="DejaVu Sans Mono"/>
+          <w:sz w:val="18"/>
+        </w:rPr>
+        <w:t xml:space="preserve">    android:id="@+id/phoneInput"</w:t>
+      </w:r>
+    </w:p>
+    <w:p>
+      <w:pPr>
+        <w:keepNext/>
+        <w:spacing w:after="0"/>
+      </w:pPr>
+      <w:r>
+        <w:rPr>
+          <w:rFonts w:ascii="DejaVu Sans Mono" w:hAnsi="DejaVu Sans Mono"/>
+          <w:sz w:val="18"/>
+        </w:rPr>
+        <w:t xml:space="preserve">    android:inputType="phone"</w:t>
+      </w:r>
+    </w:p>
+    <w:p>
+      <w:pPr>
+        <w:keepNext w:val="0"/>
+        <w:spacing w:after="0"/>
+      </w:pPr>
+      <w:r>
+        <w:rPr>
+          <w:rFonts w:ascii="DejaVu Sans Mono" w:hAnsi="DejaVu Sans Mono"/>
+          <w:sz w:val="18"/>
+        </w:rPr>
+        <w:t xml:space="preserve">    android:digits="0123456789" /&gt;</w:t>
+      </w:r>
+    </w:p>
+    <w:p>
+      <w:pPr>
+        <w:pStyle w:val="Heading2"/>
+      </w:pPr>
+      <w:r>
+        <w:t>Giới tính mặc định Nam</w:t>
+      </w:r>
+    </w:p>
+    <w:p>
+      <w:pPr>
+        <w:pStyle w:val="Caption"/>
+      </w:pPr>
+      <w:r>
+        <w:t>app/src/main/res/layout/activity_add_contact.xml</w:t>
+      </w:r>
+    </w:p>
+    <w:p>
+      <w:pPr>
+        <w:keepNext/>
+        <w:spacing w:after="0"/>
+      </w:pPr>
+      <w:r>
+        <w:rPr>
+          <w:rFonts w:ascii="DejaVu Sans Mono" w:hAnsi="DejaVu Sans Mono"/>
+          <w:sz w:val="18"/>
+        </w:rPr>
+        <w:t>&lt;RadioGroup</w:t>
+      </w:r>
+    </w:p>
+    <w:p>
+      <w:pPr>
+        <w:keepNext/>
+        <w:spacing w:after="0"/>
+      </w:pPr>
+      <w:r>
+        <w:rPr>
+          <w:rFonts w:ascii="DejaVu Sans Mono" w:hAnsi="DejaVu Sans Mono"/>
+          <w:sz w:val="18"/>
+        </w:rPr>
+        <w:t xml:space="preserve">    android:id="@+id/genderInput"</w:t>
+      </w:r>
+    </w:p>
+    <w:p>
+      <w:pPr>
+        <w:keepNext/>
+        <w:spacing w:after="0"/>
+      </w:pPr>
+      <w:r>
+        <w:rPr>
+          <w:rFonts w:ascii="DejaVu Sans Mono" w:hAnsi="DejaVu Sans Mono"/>
+          <w:sz w:val="18"/>
+        </w:rPr>
+        <w:t xml:space="preserve">    android:checkedButton="@id/genderMale"&gt;</w:t>
+      </w:r>
+    </w:p>
+    <w:p>
+      <w:pPr>
+        <w:keepNext/>
+        <w:spacing w:after="0"/>
+      </w:pPr>
+      <w:r>
+        <w:rPr>
+          <w:rFonts w:ascii="DejaVu Sans Mono" w:hAnsi="DejaVu Sans Mono"/>
+          <w:sz w:val="18"/>
+        </w:rPr>
+        <w:t xml:space="preserve">    &lt;RadioButton android:id="@+id/genderMale" /&gt;</w:t>
+      </w:r>
+    </w:p>
+    <w:p>
+      <w:pPr>
+        <w:keepNext/>
+        <w:spacing w:after="0"/>
+      </w:pPr>
+      <w:r>
+        <w:rPr>
+          <w:rFonts w:ascii="DejaVu Sans Mono" w:hAnsi="DejaVu Sans Mono"/>
+          <w:sz w:val="18"/>
+        </w:rPr>
+        <w:t xml:space="preserve">    &lt;RadioButton android:id="@+id/genderFemale" /&gt;</w:t>
+      </w:r>
+    </w:p>
+    <w:p>
+      <w:pPr>
+        <w:keepNext/>
+        <w:spacing w:after="0"/>
+      </w:pPr>
+      <w:r>
+        <w:rPr>
+          <w:rFonts w:ascii="DejaVu Sans Mono" w:hAnsi="DejaVu Sans Mono"/>
+          <w:sz w:val="18"/>
+        </w:rPr>
+        <w:t xml:space="preserve">    &lt;RadioButton android:id="@+id/genderOther" /&gt;</w:t>
+      </w:r>
+    </w:p>
+    <w:p>
+      <w:pPr>
+        <w:keepNext w:val="0"/>
+        <w:spacing w:after="0"/>
+      </w:pPr>
+      <w:r>
+        <w:rPr>
+          <w:rFonts w:ascii="DejaVu Sans Mono" w:hAnsi="DejaVu Sans Mono"/>
+          <w:sz w:val="18"/>
+        </w:rPr>
+        <w:t>&lt;/RadioGroup&gt;</w:t>
+      </w:r>
+    </w:p>
+    <w:p>
+      <w:pPr>
+        <w:pStyle w:val="Heading2"/>
+      </w:pPr>
+      <w:r>
+        <w:t>Ghi chú nhiều dòng và không bắt buộc</w:t>
+      </w:r>
+    </w:p>
+    <w:p>
+      <w:pPr>
+        <w:pStyle w:val="Caption"/>
+      </w:pPr>
+      <w:r>
+        <w:t>app/src/main/res/layout/activity_add_contact.xml</w:t>
+      </w:r>
+    </w:p>
+    <w:p>
+      <w:pPr>
+        <w:keepNext/>
+        <w:spacing w:after="0"/>
+      </w:pPr>
+      <w:r>
+        <w:rPr>
+          <w:rFonts w:ascii="DejaVu Sans Mono" w:hAnsi="DejaVu Sans Mono"/>
+          <w:sz w:val="18"/>
+        </w:rPr>
+        <w:t>&lt;EditText</w:t>
+      </w:r>
+    </w:p>
+    <w:p>
+      <w:pPr>
+        <w:keepNext/>
+        <w:spacing w:after="0"/>
+      </w:pPr>
+      <w:r>
+        <w:rPr>
+          <w:rFonts w:ascii="DejaVu Sans Mono" w:hAnsi="DejaVu Sans Mono"/>
+          <w:sz w:val="18"/>
+        </w:rPr>
+        <w:t xml:space="preserve">    android:id="@+id/notesInput"</w:t>
+      </w:r>
+    </w:p>
+    <w:p>
+      <w:pPr>
+        <w:keepNext/>
+        <w:spacing w:after="0"/>
+      </w:pPr>
+      <w:r>
+        <w:rPr>
+          <w:rFonts w:ascii="DejaVu Sans Mono" w:hAnsi="DejaVu Sans Mono"/>
+          <w:sz w:val="18"/>
+        </w:rPr>
+        <w:t xml:space="preserve">    android:inputType="textMultiLine|textCapSentences"</w:t>
+      </w:r>
+    </w:p>
+    <w:p>
+      <w:pPr>
+        <w:keepNext/>
+        <w:spacing w:after="0"/>
+      </w:pPr>
+      <w:r>
+        <w:rPr>
+          <w:rFonts w:ascii="DejaVu Sans Mono" w:hAnsi="DejaVu Sans Mono"/>
+          <w:sz w:val="18"/>
+        </w:rPr>
+        <w:t xml:space="preserve">    android:minLines="2"</w:t>
+      </w:r>
+    </w:p>
+    <w:p>
+      <w:pPr>
+        <w:keepNext w:val="0"/>
+        <w:spacing w:after="0"/>
+      </w:pPr>
+      <w:r>
+        <w:rPr>
+          <w:rFonts w:ascii="DejaVu Sans Mono" w:hAnsi="DejaVu Sans Mono"/>
+          <w:sz w:val="18"/>
+        </w:rPr>
+        <w:t xml:space="preserve">    android:gravity="top" /&gt;</w:t>
+      </w:r>
+    </w:p>
+    <w:p>
+      <w:pPr>
+        <w:spacing w:before="120"/>
+      </w:pPr>
+      <w:r>
+        <w:t>Các đoạn trên trích các thuộc tính liên quan tới yêu cầu; những thuộc tính trình bày như style, kích thước và khoảng cách được lược bỏ để dễ đọc. File XML đầy đủ nằm trong repository.</w:t>
       </w:r>
     </w:p>
     <w:p>
@@ -1820,7 +3833,7 @@
               <w:rPr>
                 <w:sz w:val="20"/>
               </w:rPr>
-              <w:t>3 test luồng tích hợp; có ảnh chụp minh chứng.</w:t>
+              <w:t>5 test luồng tích hợp; có ảnh chụp minh chứng.</w:t>
             </w:r>
           </w:p>
         </w:tc>
@@ -1884,6 +3897,786 @@
       </w:pPr>
       <w:r>
         <w:t>Các bài kiểm thử đã chạy trên một ảnh hệ thống máy ảo; chưa kiểm thử trên mọi thiết bị Android. Bộ nhớ danh bạ chỉ tồn tại trong vòng đời tiến trình theo phạm vi đề bài. Mã nguồn, báo cáo và ảnh gốc nằm trong repository; các thư mục sinh tự động và local.properties được loại bằng .gitignore.</w:t>
+      </w:r>
+    </w:p>
+    <w:p>
+      <w:r>
+        <w:br w:type="page"/>
+      </w:r>
+    </w:p>
+    <w:p>
+      <w:pPr>
+        <w:pStyle w:val="Heading1"/>
+      </w:pPr>
+      <w:r>
+        <w:t>Minh chứng kiểm tra dữ liệu nhập</w:t>
+      </w:r>
+    </w:p>
+    <w:p>
+      <w:pPr>
+        <w:spacing w:before="120"/>
+      </w:pPr>
+      <w:r>
+        <w:t>Bên cạnh trạng thái sai tài khoản và số trùng, ứng dụng cũng chặn trường hợp bỏ trống tên đăng nhập hoặc mật khẩu, tên liên hệ trống và số điện thoại sai định dạng. Hai ảnh dưới đây ghi lại thông báo trực tiếp khi thao tác trên máy ảo.</w:t>
+      </w:r>
+    </w:p>
+    <w:p>
+      <w:pPr>
+        <w:spacing w:after="60"/>
+        <w:jc w:val="center"/>
+      </w:pPr>
+      <w:r>
+        <w:drawing>
+          <wp:inline xmlns:a="http://schemas.openxmlformats.org/drawingml/2006/main" xmlns:pic="http://schemas.openxmlformats.org/drawingml/2006/picture">
+            <wp:extent cx="2560320" cy="5689600"/>
+            <wp:docPr id="11" name="Picture 11"/>
+            <wp:cNvGraphicFramePr>
+              <a:graphicFrameLocks noChangeAspect="1"/>
+            </wp:cNvGraphicFramePr>
+            <a:graphic>
+              <a:graphicData uri="http://schemas.openxmlformats.org/drawingml/2006/picture">
+                <pic:pic>
+                  <pic:nvPicPr>
+                    <pic:cNvPr id="0" name="12_login_empty.png"/>
+                    <pic:cNvPicPr/>
+                  </pic:nvPicPr>
+                  <pic:blipFill>
+                    <a:blip r:embed="rId19"/>
+                    <a:stretch>
+                      <a:fillRect/>
+                    </a:stretch>
+                  </pic:blipFill>
+                  <pic:spPr>
+                    <a:xfrm>
+                      <a:off x="0" y="0"/>
+                      <a:ext cx="2560320" cy="5689600"/>
+                    </a:xfrm>
+                    <a:prstGeom prst="rect"/>
+                  </pic:spPr>
+                </pic:pic>
+              </a:graphicData>
+            </a:graphic>
+          </wp:inline>
+        </w:drawing>
+      </w:r>
+      <w:r>
+        <w:t xml:space="preserve">   </w:t>
+      </w:r>
+      <w:r>
+        <w:drawing>
+          <wp:inline xmlns:a="http://schemas.openxmlformats.org/drawingml/2006/main" xmlns:pic="http://schemas.openxmlformats.org/drawingml/2006/picture">
+            <wp:extent cx="2560320" cy="5689600"/>
+            <wp:docPr id="12" name="Picture 12"/>
+            <wp:cNvGraphicFramePr>
+              <a:graphicFrameLocks noChangeAspect="1"/>
+            </wp:cNvGraphicFramePr>
+            <a:graphic>
+              <a:graphicData uri="http://schemas.openxmlformats.org/drawingml/2006/picture">
+                <pic:pic>
+                  <pic:nvPicPr>
+                    <pic:cNvPr id="0" name="04_add_invalid.png"/>
+                    <pic:cNvPicPr/>
+                  </pic:nvPicPr>
+                  <pic:blipFill>
+                    <a:blip r:embed="rId20"/>
+                    <a:stretch>
+                      <a:fillRect/>
+                    </a:stretch>
+                  </pic:blipFill>
+                  <pic:spPr>
+                    <a:xfrm>
+                      <a:off x="0" y="0"/>
+                      <a:ext cx="2560320" cy="5689600"/>
+                    </a:xfrm>
+                    <a:prstGeom prst="rect"/>
+                  </pic:spPr>
+                </pic:pic>
+              </a:graphicData>
+            </a:graphic>
+          </wp:inline>
+        </w:drawing>
+      </w:r>
+    </w:p>
+    <w:p>
+      <w:pPr>
+        <w:pStyle w:val="Caption"/>
+        <w:jc w:val="center"/>
+      </w:pPr>
+      <w:r>
+        <w:t>Hình 11 bên trái: đăng nhập thiếu thông tin. Hình 12 bên phải: số điện thoại chưa đủ 10 chữ số.</w:t>
+      </w:r>
+    </w:p>
+    <w:p>
+      <w:pPr>
+        <w:spacing w:before="120"/>
+      </w:pPr>
+      <w:r>
+        <w:t>Kiểm thử còn nhập số 9012345678 (đủ 10 chữ số nhưng không bắt đầu bằng 0) và 09012345678 (11 chữ số); cả hai bị từ chối và tổng liên hệ không thay đổi. Ghi chú được phép để trống; các nhóm và ba giới tính đã được kiểm tra khi thêm liên hệ.</w:t>
+      </w:r>
+    </w:p>
+    <w:p>
+      <w:r>
+        <w:br w:type="page"/>
+      </w:r>
+    </w:p>
+    <w:p>
+      <w:pPr>
+        <w:pStyle w:val="Heading1"/>
+      </w:pPr>
+      <w:r>
+        <w:t>9 Đối chiếu yêu cầu nộp bài</w:t>
+      </w:r>
+    </w:p>
+    <w:p>
+      <w:pPr>
+        <w:spacing w:before="120"/>
+      </w:pPr>
+      <w:r>
+        <w:t>Bảng dưới ánh xạ các mục của đề tới chức năng, minh chứng và phần báo cáo. Bảng đối chiếu chi tiết nằm trong docs/DOI_CHIEU_YEU_CAU.md của repository.</w:t>
+      </w:r>
+    </w:p>
+    <w:tbl>
+      <w:tblPr>
+        <w:tblStyle w:val="TableGrid"/>
+        <w:tblW w:type="auto" w:w="0"/>
+        <w:tblLayout w:type="fixed"/>
+        <w:tblLook w:firstColumn="1" w:firstRow="1" w:lastColumn="0" w:lastRow="0" w:noHBand="0" w:noVBand="1" w:val="04A0"/>
+      </w:tblPr>
+      <w:tblGrid>
+        <w:gridCol w:w="4608"/>
+        <w:gridCol w:w="5616"/>
+      </w:tblGrid>
+      <w:tr>
+        <w:tc>
+          <w:tcPr>
+            <w:tcW w:type="dxa" w:w="4608"/>
+            <w:shd w:fill="E7E6E6"/>
+            <w:vAlign w:val="center"/>
+            <w:tcBorders>
+              <w:top w:val="single" w:sz="4" w:color="D9D9D9"/>
+              <w:left w:val="single" w:sz="4" w:color="D9D9D9"/>
+              <w:bottom w:val="single" w:sz="4" w:color="D9D9D9"/>
+              <w:right w:val="single" w:sz="4" w:color="D9D9D9"/>
+            </w:tcBorders>
+            <w:tcMar>
+              <w:top w:w="80" w:type="dxa"/>
+              <w:bottom w:w="80" w:type="dxa"/>
+              <w:left w:w="80" w:type="dxa"/>
+              <w:right w:w="80" w:type="dxa"/>
+            </w:tcMar>
+          </w:tcPr>
+          <w:p>
+            <w:pPr>
+              <w:spacing w:after="40"/>
+            </w:pPr>
+            <w:r>
+              <w:rPr>
+                <w:b/>
+                <w:color w:val="000000"/>
+                <w:sz w:val="20"/>
+              </w:rPr>
+              <w:t>Mục của đề</w:t>
+            </w:r>
+          </w:p>
+        </w:tc>
+        <w:tc>
+          <w:tcPr>
+            <w:tcW w:type="dxa" w:w="5616"/>
+            <w:shd w:fill="E7E6E6"/>
+            <w:vAlign w:val="center"/>
+            <w:tcBorders>
+              <w:top w:val="single" w:sz="4" w:color="D9D9D9"/>
+              <w:left w:val="single" w:sz="4" w:color="D9D9D9"/>
+              <w:bottom w:val="single" w:sz="4" w:color="D9D9D9"/>
+              <w:right w:val="single" w:sz="4" w:color="D9D9D9"/>
+            </w:tcBorders>
+            <w:tcMar>
+              <w:top w:w="80" w:type="dxa"/>
+              <w:bottom w:w="80" w:type="dxa"/>
+              <w:left w:w="80" w:type="dxa"/>
+              <w:right w:w="80" w:type="dxa"/>
+            </w:tcMar>
+          </w:tcPr>
+          <w:p>
+            <w:pPr>
+              <w:spacing w:after="40"/>
+            </w:pPr>
+            <w:r>
+              <w:rPr>
+                <w:b/>
+                <w:color w:val="000000"/>
+                <w:sz w:val="20"/>
+              </w:rPr>
+              <w:t>Nội dung và minh chứng</w:t>
+            </w:r>
+          </w:p>
+        </w:tc>
+      </w:tr>
+      <w:tr>
+        <w:tc>
+          <w:tcPr>
+            <w:tcW w:type="dxa" w:w="4608"/>
+            <w:vAlign w:val="center"/>
+            <w:tcBorders>
+              <w:top w:val="single" w:sz="4" w:color="D9D9D9"/>
+              <w:left w:val="single" w:sz="4" w:color="D9D9D9"/>
+              <w:bottom w:val="single" w:sz="4" w:color="D9D9D9"/>
+              <w:right w:val="single" w:sz="4" w:color="D9D9D9"/>
+            </w:tcBorders>
+            <w:tcMar>
+              <w:top w:w="80" w:type="dxa"/>
+              <w:bottom w:w="80" w:type="dxa"/>
+              <w:left w:w="80" w:type="dxa"/>
+              <w:right w:w="80" w:type="dxa"/>
+            </w:tcMar>
+            <w:shd w:fill="FFFFFF"/>
+          </w:tcPr>
+          <w:p>
+            <w:pPr>
+              <w:spacing w:after="40"/>
+            </w:pPr>
+            <w:r>
+              <w:rPr>
+                <w:sz w:val="20"/>
+              </w:rPr>
+              <w:t>1 Phạm vi</w:t>
+            </w:r>
+          </w:p>
+        </w:tc>
+        <w:tc>
+          <w:tcPr>
+            <w:tcW w:type="dxa" w:w="5616"/>
+            <w:vAlign w:val="center"/>
+            <w:tcBorders>
+              <w:top w:val="single" w:sz="4" w:color="D9D9D9"/>
+              <w:left w:val="single" w:sz="4" w:color="D9D9D9"/>
+              <w:bottom w:val="single" w:sz="4" w:color="D9D9D9"/>
+              <w:right w:val="single" w:sz="4" w:color="D9D9D9"/>
+            </w:tcBorders>
+            <w:tcMar>
+              <w:top w:w="80" w:type="dxa"/>
+              <w:bottom w:w="80" w:type="dxa"/>
+              <w:left w:w="80" w:type="dxa"/>
+              <w:right w:w="80" w:type="dxa"/>
+            </w:tcMar>
+            <w:shd w:fill="FFFFFF"/>
+          </w:tcPr>
+          <w:p>
+            <w:pPr>
+              <w:spacing w:after="40"/>
+            </w:pPr>
+            <w:r>
+              <w:rPr>
+                <w:sz w:val="20"/>
+              </w:rPr>
+              <w:t>Java/XML; 4 Activity; Intent và Serializable; Contact đủ 6 trường nghiệp vụ; ArrayList trong RAM.</w:t>
+            </w:r>
+          </w:p>
+        </w:tc>
+      </w:tr>
+      <w:tr>
+        <w:tc>
+          <w:tcPr>
+            <w:tcW w:type="dxa" w:w="4608"/>
+            <w:vAlign w:val="center"/>
+            <w:tcBorders>
+              <w:top w:val="single" w:sz="4" w:color="D9D9D9"/>
+              <w:left w:val="single" w:sz="4" w:color="D9D9D9"/>
+              <w:bottom w:val="single" w:sz="4" w:color="D9D9D9"/>
+              <w:right w:val="single" w:sz="4" w:color="D9D9D9"/>
+            </w:tcBorders>
+            <w:tcMar>
+              <w:top w:w="80" w:type="dxa"/>
+              <w:bottom w:w="80" w:type="dxa"/>
+              <w:left w:w="80" w:type="dxa"/>
+              <w:right w:w="80" w:type="dxa"/>
+            </w:tcMar>
+            <w:shd w:fill="FFFFFF"/>
+          </w:tcPr>
+          <w:p>
+            <w:pPr>
+              <w:spacing w:after="40"/>
+            </w:pPr>
+            <w:r>
+              <w:rPr>
+                <w:sz w:val="20"/>
+              </w:rPr>
+              <w:t>2.1 Đăng nhập</w:t>
+            </w:r>
+          </w:p>
+        </w:tc>
+        <w:tc>
+          <w:tcPr>
+            <w:tcW w:type="dxa" w:w="5616"/>
+            <w:vAlign w:val="center"/>
+            <w:tcBorders>
+              <w:top w:val="single" w:sz="4" w:color="D9D9D9"/>
+              <w:left w:val="single" w:sz="4" w:color="D9D9D9"/>
+              <w:bottom w:val="single" w:sz="4" w:color="D9D9D9"/>
+              <w:right w:val="single" w:sz="4" w:color="D9D9D9"/>
+            </w:tcBorders>
+            <w:tcMar>
+              <w:top w:w="80" w:type="dxa"/>
+              <w:bottom w:w="80" w:type="dxa"/>
+              <w:left w:w="80" w:type="dxa"/>
+              <w:right w:w="80" w:type="dxa"/>
+            </w:tcMar>
+            <w:shd w:fill="FFFFFF"/>
+          </w:tcPr>
+          <w:p>
+            <w:pPr>
+              <w:spacing w:after="40"/>
+            </w:pPr>
+            <w:r>
+              <w:rPr>
+                <w:sz w:val="20"/>
+              </w:rPr>
+              <w:t>EditText tên/mật khẩu ẩn; lỗi trống/sai; admin / 123456; Intent và finish(); hình 1, 2 và mã đăng nhập.</w:t>
+            </w:r>
+          </w:p>
+        </w:tc>
+      </w:tr>
+      <w:tr>
+        <w:tc>
+          <w:tcPr>
+            <w:tcW w:type="dxa" w:w="4608"/>
+            <w:vAlign w:val="center"/>
+            <w:tcBorders>
+              <w:top w:val="single" w:sz="4" w:color="D9D9D9"/>
+              <w:left w:val="single" w:sz="4" w:color="D9D9D9"/>
+              <w:bottom w:val="single" w:sz="4" w:color="D9D9D9"/>
+              <w:right w:val="single" w:sz="4" w:color="D9D9D9"/>
+            </w:tcBorders>
+            <w:tcMar>
+              <w:top w:w="80" w:type="dxa"/>
+              <w:bottom w:w="80" w:type="dxa"/>
+              <w:left w:w="80" w:type="dxa"/>
+              <w:right w:w="80" w:type="dxa"/>
+            </w:tcMar>
+            <w:shd w:fill="FFFFFF"/>
+          </w:tcPr>
+          <w:p>
+            <w:pPr>
+              <w:spacing w:after="40"/>
+            </w:pPr>
+            <w:r>
+              <w:rPr>
+                <w:sz w:val="20"/>
+              </w:rPr>
+              <w:t>2.2 Danh sách</w:t>
+            </w:r>
+          </w:p>
+        </w:tc>
+        <w:tc>
+          <w:tcPr>
+            <w:tcW w:type="dxa" w:w="5616"/>
+            <w:vAlign w:val="center"/>
+            <w:tcBorders>
+              <w:top w:val="single" w:sz="4" w:color="D9D9D9"/>
+              <w:left w:val="single" w:sz="4" w:color="D9D9D9"/>
+              <w:bottom w:val="single" w:sz="4" w:color="D9D9D9"/>
+              <w:right w:val="single" w:sz="4" w:color="D9D9D9"/>
+            </w:tcBorders>
+            <w:tcMar>
+              <w:top w:w="80" w:type="dxa"/>
+              <w:bottom w:w="80" w:type="dxa"/>
+              <w:left w:w="80" w:type="dxa"/>
+              <w:right w:w="80" w:type="dxa"/>
+            </w:tcMar>
+            <w:shd w:fill="FFFFFF"/>
+          </w:tcPr>
+          <w:p>
+            <w:pPr>
+              <w:spacing w:after="40"/>
+            </w:pPr>
+            <w:r>
+              <w:rPr>
+                <w:sz w:val="20"/>
+              </w:rPr>
+              <w:t>ListView/Adapter đủ avatar, tên, số, nhóm, sao; thống kê; thêm/chi tiết; đúng 3 mẫu; hình 3, 4.</w:t>
+            </w:r>
+          </w:p>
+        </w:tc>
+      </w:tr>
+      <w:tr>
+        <w:tc>
+          <w:tcPr>
+            <w:tcW w:type="dxa" w:w="4608"/>
+            <w:vAlign w:val="center"/>
+            <w:tcBorders>
+              <w:top w:val="single" w:sz="4" w:color="D9D9D9"/>
+              <w:left w:val="single" w:sz="4" w:color="D9D9D9"/>
+              <w:bottom w:val="single" w:sz="4" w:color="D9D9D9"/>
+              <w:right w:val="single" w:sz="4" w:color="D9D9D9"/>
+            </w:tcBorders>
+            <w:tcMar>
+              <w:top w:w="80" w:type="dxa"/>
+              <w:bottom w:w="80" w:type="dxa"/>
+              <w:left w:w="80" w:type="dxa"/>
+              <w:right w:w="80" w:type="dxa"/>
+            </w:tcMar>
+            <w:shd w:fill="FFFFFF"/>
+          </w:tcPr>
+          <w:p>
+            <w:pPr>
+              <w:spacing w:after="40"/>
+            </w:pPr>
+            <w:r>
+              <w:rPr>
+                <w:sz w:val="20"/>
+              </w:rPr>
+              <w:t>2.3 Thêm liên hệ</w:t>
+            </w:r>
+          </w:p>
+        </w:tc>
+        <w:tc>
+          <w:tcPr>
+            <w:tcW w:type="dxa" w:w="5616"/>
+            <w:vAlign w:val="center"/>
+            <w:tcBorders>
+              <w:top w:val="single" w:sz="4" w:color="D9D9D9"/>
+              <w:left w:val="single" w:sz="4" w:color="D9D9D9"/>
+              <w:bottom w:val="single" w:sz="4" w:color="D9D9D9"/>
+              <w:right w:val="single" w:sz="4" w:color="D9D9D9"/>
+            </w:tcBorders>
+            <w:tcMar>
+              <w:top w:w="80" w:type="dxa"/>
+              <w:bottom w:w="80" w:type="dxa"/>
+              <w:left w:w="80" w:type="dxa"/>
+              <w:right w:w="80" w:type="dxa"/>
+            </w:tcMar>
+            <w:shd w:fill="FFFFFF"/>
+          </w:tcPr>
+          <w:p>
+            <w:pPr>
+              <w:spacing w:after="40"/>
+            </w:pPr>
+            <w:r>
+              <w:rPr>
+                <w:sz w:val="20"/>
+              </w:rPr>
+              <w:t>Đủ 7 thành phần; 4 nhóm; 3 giới tính mặc định Nam; ghi chú tùy chọn; kiểm tra trống/10 số/đầu 0/trùng; hình 5, 6.</w:t>
+            </w:r>
+          </w:p>
+        </w:tc>
+      </w:tr>
+      <w:tr>
+        <w:tc>
+          <w:tcPr>
+            <w:tcW w:type="dxa" w:w="4608"/>
+            <w:vAlign w:val="center"/>
+            <w:tcBorders>
+              <w:top w:val="single" w:sz="4" w:color="D9D9D9"/>
+              <w:left w:val="single" w:sz="4" w:color="D9D9D9"/>
+              <w:bottom w:val="single" w:sz="4" w:color="D9D9D9"/>
+              <w:right w:val="single" w:sz="4" w:color="D9D9D9"/>
+            </w:tcBorders>
+            <w:tcMar>
+              <w:top w:w="80" w:type="dxa"/>
+              <w:bottom w:w="80" w:type="dxa"/>
+              <w:left w:w="80" w:type="dxa"/>
+              <w:right w:w="80" w:type="dxa"/>
+            </w:tcMar>
+            <w:shd w:fill="FFFFFF"/>
+          </w:tcPr>
+          <w:p>
+            <w:pPr>
+              <w:spacing w:after="40"/>
+            </w:pPr>
+            <w:r>
+              <w:rPr>
+                <w:sz w:val="20"/>
+              </w:rPr>
+              <w:t>2.4 Chi tiết</w:t>
+            </w:r>
+          </w:p>
+        </w:tc>
+        <w:tc>
+          <w:tcPr>
+            <w:tcW w:type="dxa" w:w="5616"/>
+            <w:vAlign w:val="center"/>
+            <w:tcBorders>
+              <w:top w:val="single" w:sz="4" w:color="D9D9D9"/>
+              <w:left w:val="single" w:sz="4" w:color="D9D9D9"/>
+              <w:bottom w:val="single" w:sz="4" w:color="D9D9D9"/>
+              <w:right w:val="single" w:sz="4" w:color="D9D9D9"/>
+            </w:tcBorders>
+            <w:tcMar>
+              <w:top w:w="80" w:type="dxa"/>
+              <w:bottom w:w="80" w:type="dxa"/>
+              <w:left w:w="80" w:type="dxa"/>
+              <w:right w:w="80" w:type="dxa"/>
+            </w:tcMar>
+            <w:shd w:fill="FFFFFF"/>
+          </w:tcPr>
+          <w:p>
+            <w:pPr>
+              <w:spacing w:after="40"/>
+            </w:pPr>
+            <w:r>
+              <w:rPr>
+                <w:sz w:val="20"/>
+              </w:rPr>
+              <w:t>Đủ thông tin; CheckBox yêu thích; ACTION_DIAL; Quay lại; Xóa; cập nhật thống kê; hình 7 đến 10.</w:t>
+            </w:r>
+          </w:p>
+        </w:tc>
+      </w:tr>
+      <w:tr>
+        <w:tc>
+          <w:tcPr>
+            <w:tcW w:type="dxa" w:w="4608"/>
+            <w:vAlign w:val="center"/>
+            <w:tcBorders>
+              <w:top w:val="single" w:sz="4" w:color="D9D9D9"/>
+              <w:left w:val="single" w:sz="4" w:color="D9D9D9"/>
+              <w:bottom w:val="single" w:sz="4" w:color="D9D9D9"/>
+              <w:right w:val="single" w:sz="4" w:color="D9D9D9"/>
+            </w:tcBorders>
+            <w:tcMar>
+              <w:top w:w="80" w:type="dxa"/>
+              <w:bottom w:w="80" w:type="dxa"/>
+              <w:left w:w="80" w:type="dxa"/>
+              <w:right w:w="80" w:type="dxa"/>
+            </w:tcMar>
+            <w:shd w:fill="FFFFFF"/>
+          </w:tcPr>
+          <w:p>
+            <w:pPr>
+              <w:spacing w:after="40"/>
+            </w:pPr>
+            <w:r>
+              <w:rPr>
+                <w:sz w:val="20"/>
+              </w:rPr>
+              <w:t>3.1 Sản phẩm nộp</w:t>
+            </w:r>
+          </w:p>
+        </w:tc>
+        <w:tc>
+          <w:tcPr>
+            <w:tcW w:type="dxa" w:w="5616"/>
+            <w:vAlign w:val="center"/>
+            <w:tcBorders>
+              <w:top w:val="single" w:sz="4" w:color="D9D9D9"/>
+              <w:left w:val="single" w:sz="4" w:color="D9D9D9"/>
+              <w:bottom w:val="single" w:sz="4" w:color="D9D9D9"/>
+              <w:right w:val="single" w:sz="4" w:color="D9D9D9"/>
+            </w:tcBorders>
+            <w:tcMar>
+              <w:top w:w="80" w:type="dxa"/>
+              <w:bottom w:w="80" w:type="dxa"/>
+              <w:left w:w="80" w:type="dxa"/>
+              <w:right w:w="80" w:type="dxa"/>
+            </w:tcMar>
+            <w:shd w:fill="FFFFFF"/>
+          </w:tcPr>
+          <w:p>
+            <w:pPr>
+              <w:spacing w:after="40"/>
+            </w:pPr>
+            <w:r>
+              <w:rPr>
+                <w:sz w:val="20"/>
+              </w:rPr>
+              <w:t>Dự án Android Studio trên GitHub; báo cáo Word; mã nguồn và kiểm thử; .gitignore loại đúng tệp sinh tự động.</w:t>
+            </w:r>
+          </w:p>
+        </w:tc>
+      </w:tr>
+      <w:tr>
+        <w:tc>
+          <w:tcPr>
+            <w:tcW w:type="dxa" w:w="4608"/>
+            <w:vAlign w:val="center"/>
+            <w:tcBorders>
+              <w:top w:val="single" w:sz="4" w:color="D9D9D9"/>
+              <w:left w:val="single" w:sz="4" w:color="D9D9D9"/>
+              <w:bottom w:val="single" w:sz="4" w:color="D9D9D9"/>
+              <w:right w:val="single" w:sz="4" w:color="D9D9D9"/>
+            </w:tcBorders>
+            <w:tcMar>
+              <w:top w:w="80" w:type="dxa"/>
+              <w:bottom w:w="80" w:type="dxa"/>
+              <w:left w:w="80" w:type="dxa"/>
+              <w:right w:w="80" w:type="dxa"/>
+            </w:tcMar>
+            <w:shd w:fill="FFFFFF"/>
+          </w:tcPr>
+          <w:p>
+            <w:pPr>
+              <w:spacing w:after="40"/>
+            </w:pPr>
+            <w:r>
+              <w:rPr>
+                <w:sz w:val="20"/>
+              </w:rPr>
+              <w:t>3.2 Hình ảnh và mô tả</w:t>
+            </w:r>
+          </w:p>
+        </w:tc>
+        <w:tc>
+          <w:tcPr>
+            <w:tcW w:type="dxa" w:w="5616"/>
+            <w:vAlign w:val="center"/>
+            <w:tcBorders>
+              <w:top w:val="single" w:sz="4" w:color="D9D9D9"/>
+              <w:left w:val="single" w:sz="4" w:color="D9D9D9"/>
+              <w:bottom w:val="single" w:sz="4" w:color="D9D9D9"/>
+              <w:right w:val="single" w:sz="4" w:color="D9D9D9"/>
+            </w:tcBorders>
+            <w:tcMar>
+              <w:top w:w="80" w:type="dxa"/>
+              <w:bottom w:w="80" w:type="dxa"/>
+              <w:left w:w="80" w:type="dxa"/>
+              <w:right w:w="80" w:type="dxa"/>
+            </w:tcMar>
+            <w:shd w:fill="FFFFFF"/>
+          </w:tcPr>
+          <w:p>
+            <w:pPr>
+              <w:spacing w:after="40"/>
+            </w:pPr>
+            <w:r>
+              <w:rPr>
+                <w:sz w:val="20"/>
+              </w:rPr>
+              <w:t>Cả 4 màn hình có ảnh chụp ứng dụng, chú thích, mô tả component/lớp/hàm/sự kiện và trích đoạn mã.</w:t>
+            </w:r>
+          </w:p>
+        </w:tc>
+      </w:tr>
+      <w:tr>
+        <w:tc>
+          <w:tcPr>
+            <w:tcW w:type="dxa" w:w="4608"/>
+            <w:vAlign w:val="center"/>
+            <w:tcBorders>
+              <w:top w:val="single" w:sz="4" w:color="D9D9D9"/>
+              <w:left w:val="single" w:sz="4" w:color="D9D9D9"/>
+              <w:bottom w:val="single" w:sz="4" w:color="D9D9D9"/>
+              <w:right w:val="single" w:sz="4" w:color="D9D9D9"/>
+            </w:tcBorders>
+            <w:tcMar>
+              <w:top w:w="80" w:type="dxa"/>
+              <w:bottom w:w="80" w:type="dxa"/>
+              <w:left w:w="80" w:type="dxa"/>
+              <w:right w:w="80" w:type="dxa"/>
+            </w:tcMar>
+            <w:shd w:fill="FFFFFF"/>
+          </w:tcPr>
+          <w:p>
+            <w:pPr>
+              <w:spacing w:after="40"/>
+            </w:pPr>
+            <w:r>
+              <w:rPr>
+                <w:sz w:val="20"/>
+              </w:rPr>
+              <w:t>3.3 Định danh</w:t>
+            </w:r>
+          </w:p>
+        </w:tc>
+        <w:tc>
+          <w:tcPr>
+            <w:tcW w:type="dxa" w:w="5616"/>
+            <w:vAlign w:val="center"/>
+            <w:tcBorders>
+              <w:top w:val="single" w:sz="4" w:color="D9D9D9"/>
+              <w:left w:val="single" w:sz="4" w:color="D9D9D9"/>
+              <w:bottom w:val="single" w:sz="4" w:color="D9D9D9"/>
+              <w:right w:val="single" w:sz="4" w:color="D9D9D9"/>
+            </w:tcBorders>
+            <w:tcMar>
+              <w:top w:w="80" w:type="dxa"/>
+              <w:bottom w:w="80" w:type="dxa"/>
+              <w:left w:w="80" w:type="dxa"/>
+              <w:right w:w="80" w:type="dxa"/>
+            </w:tcMar>
+            <w:shd w:fill="FFFFFF"/>
+          </w:tcPr>
+          <w:p>
+            <w:pPr>
+              <w:spacing w:after="40"/>
+            </w:pPr>
+            <w:r>
+              <w:rPr>
+                <w:sz w:val="20"/>
+              </w:rPr>
+              <w:t>B24DCCC047_PhamHaiDang_BaoCao.docx; đúng tên repository; đầu báo cáo có họ tên, MSSV, D24CQPM03 và link Git.</w:t>
+            </w:r>
+          </w:p>
+        </w:tc>
+      </w:tr>
+      <w:tr>
+        <w:tc>
+          <w:tcPr>
+            <w:tcW w:type="dxa" w:w="4608"/>
+            <w:vAlign w:val="center"/>
+            <w:tcBorders>
+              <w:top w:val="single" w:sz="4" w:color="D9D9D9"/>
+              <w:left w:val="single" w:sz="4" w:color="D9D9D9"/>
+              <w:bottom w:val="single" w:sz="4" w:color="D9D9D9"/>
+              <w:right w:val="single" w:sz="4" w:color="D9D9D9"/>
+            </w:tcBorders>
+            <w:tcMar>
+              <w:top w:w="80" w:type="dxa"/>
+              <w:bottom w:w="80" w:type="dxa"/>
+              <w:left w:w="80" w:type="dxa"/>
+              <w:right w:w="80" w:type="dxa"/>
+            </w:tcMar>
+            <w:shd w:fill="FFFFFF"/>
+          </w:tcPr>
+          <w:p>
+            <w:pPr>
+              <w:spacing w:after="40"/>
+            </w:pPr>
+            <w:r>
+              <w:rPr>
+                <w:sz w:val="20"/>
+              </w:rPr>
+              <w:t>3.4 Minh chứng khớp mã nguồn</w:t>
+            </w:r>
+          </w:p>
+        </w:tc>
+        <w:tc>
+          <w:tcPr>
+            <w:tcW w:type="dxa" w:w="5616"/>
+            <w:vAlign w:val="center"/>
+            <w:tcBorders>
+              <w:top w:val="single" w:sz="4" w:color="D9D9D9"/>
+              <w:left w:val="single" w:sz="4" w:color="D9D9D9"/>
+              <w:bottom w:val="single" w:sz="4" w:color="D9D9D9"/>
+              <w:right w:val="single" w:sz="4" w:color="D9D9D9"/>
+            </w:tcBorders>
+            <w:tcMar>
+              <w:top w:w="80" w:type="dxa"/>
+              <w:bottom w:w="80" w:type="dxa"/>
+              <w:left w:w="80" w:type="dxa"/>
+              <w:right w:w="80" w:type="dxa"/>
+            </w:tcMar>
+            <w:shd w:fill="FFFFFF"/>
+          </w:tcPr>
+          <w:p>
+            <w:pPr>
+              <w:spacing w:after="40"/>
+            </w:pPr>
+            <w:r>
+              <w:rPr>
+                <w:sz w:val="20"/>
+              </w:rPr>
+              <w:t>Ảnh do Espresso/UiAutomation chụp trên API 35; trích đoạn Java đọc từ file thực tế, kèm tên file và dòng.</w:t>
+            </w:r>
+          </w:p>
+        </w:tc>
+      </w:tr>
+    </w:tbl>
+    <w:p>
+      <w:pPr>
+        <w:spacing w:before="120"/>
+      </w:pPr>
+      <w:r>
+        <w:t>Repository công khai: https://github.com/DANG-PH/B24DCCC047_PhamHaiDang_QuanLyDanhBa. Bài nộp gồm dự án mã nguồn và báo cáo, không đóng gói ZIP. Mỗi kịch bản kiểm thử khởi tạo lại ba liên hệ mẫu; vì vậy ảnh thêm và ảnh xóa minh họa các kịch bản độc lập.</w:t>
       </w:r>
     </w:p>
     <w:sectPr>

</xml_diff>